<commit_message>
M2-10: update technology risks
</commit_message>
<xml_diff>
--- a/docs/risk/Risk Register.docx
+++ b/docs/risk/Risk Register.docx
@@ -4145,6 +4145,957 @@
                 <w:bCs/>
               </w:rPr>
             </w:pPr>
+            <w:r>
+              <w:rPr>
+                <w:b/>
+                <w:bCs/>
+              </w:rPr>
+              <w:t>Open</w:t>
+            </w:r>
+          </w:p>
+        </w:tc>
+      </w:tr>
+      <w:tr>
+        <w:trPr>
+          <w:trHeight w:val="300"/>
+        </w:trPr>
+        <w:tc>
+          <w:tcPr>
+            <w:tcW w:w="812" w:type="dxa"/>
+            <w:tcBorders>
+              <w:top w:val="single" w:sz="6" w:space="0" w:color="000000"/>
+              <w:left w:val="single" w:sz="6" w:space="0" w:color="000000"/>
+              <w:bottom w:val="single" w:sz="6" w:space="0" w:color="000000"/>
+              <w:right w:val="single" w:sz="6" w:space="0" w:color="000000"/>
+            </w:tcBorders>
+            <w:shd w:val="clear" w:color="auto" w:fill="FFFFFF"/>
+          </w:tcPr>
+          <w:p>
+            <w:pPr>
+              <w:rPr>
+                <w:b/>
+                <w:bCs/>
+              </w:rPr>
+            </w:pPr>
+            <w:r>
+              <w:rPr>
+                <w:b/>
+                <w:bCs/>
+              </w:rPr>
+              <w:t>R-010</w:t>
+            </w:r>
+          </w:p>
+        </w:tc>
+        <w:tc>
+          <w:tcPr>
+            <w:tcW w:w="2299" w:type="dxa"/>
+            <w:tcBorders>
+              <w:top w:val="single" w:sz="6" w:space="0" w:color="000000"/>
+              <w:left w:val="single" w:sz="6" w:space="0" w:color="000000"/>
+              <w:bottom w:val="single" w:sz="6" w:space="0" w:color="000000"/>
+              <w:right w:val="single" w:sz="6" w:space="0" w:color="000000"/>
+            </w:tcBorders>
+            <w:shd w:val="clear" w:color="auto" w:fill="FFFFFF"/>
+          </w:tcPr>
+          <w:p>
+            <w:pPr>
+              <w:rPr>
+                <w:b/>
+                <w:bCs/>
+              </w:rPr>
+            </w:pPr>
+            <w:r>
+              <w:rPr>
+                <w:b/>
+                <w:bCs/>
+              </w:rPr>
+              <w:t xml:space="preserve">Incorrect </w:t>
+            </w:r>
+            <w:proofErr w:type="spellStart"/>
+            <w:r>
+              <w:rPr>
+                <w:b/>
+                <w:bCs/>
+              </w:rPr>
+              <w:t>Supabase</w:t>
+            </w:r>
+            <w:proofErr w:type="spellEnd"/>
+            <w:r>
+              <w:rPr>
+                <w:b/>
+                <w:bCs/>
+              </w:rPr>
+              <w:t xml:space="preserve"> RLS rules could allow unauthorised access to </w:t>
+            </w:r>
+            <w:proofErr w:type="spellStart"/>
+            <w:r>
+              <w:rPr>
+                <w:b/>
+                <w:bCs/>
+              </w:rPr>
+              <w:t>CivicConnect</w:t>
+            </w:r>
+            <w:proofErr w:type="spellEnd"/>
+            <w:r>
+              <w:rPr>
+                <w:b/>
+                <w:bCs/>
+              </w:rPr>
+              <w:t xml:space="preserve"> data or block users who should have access.</w:t>
+            </w:r>
+          </w:p>
+        </w:tc>
+        <w:tc>
+          <w:tcPr>
+            <w:tcW w:w="2126" w:type="dxa"/>
+            <w:tcBorders>
+              <w:top w:val="single" w:sz="6" w:space="0" w:color="000000"/>
+              <w:left w:val="single" w:sz="6" w:space="0" w:color="000000"/>
+              <w:bottom w:val="single" w:sz="6" w:space="0" w:color="000000"/>
+              <w:right w:val="single" w:sz="6" w:space="0" w:color="000000"/>
+            </w:tcBorders>
+            <w:shd w:val="clear" w:color="auto" w:fill="FFFFFF"/>
+          </w:tcPr>
+          <w:p>
+            <w:pPr>
+              <w:rPr>
+                <w:b/>
+                <w:bCs/>
+              </w:rPr>
+            </w:pPr>
+            <w:r>
+              <w:rPr>
+                <w:b/>
+                <w:bCs/>
+              </w:rPr>
+              <w:t xml:space="preserve">The team has limited experience setting up </w:t>
+            </w:r>
+            <w:proofErr w:type="spellStart"/>
+            <w:r>
+              <w:rPr>
+                <w:b/>
+                <w:bCs/>
+              </w:rPr>
+              <w:t>Supabase</w:t>
+            </w:r>
+            <w:proofErr w:type="spellEnd"/>
+            <w:r>
+              <w:rPr>
+                <w:b/>
+                <w:bCs/>
+              </w:rPr>
+              <w:t xml:space="preserve"> RLS and role-based access rules.</w:t>
+            </w:r>
+          </w:p>
+        </w:tc>
+        <w:tc>
+          <w:tcPr>
+            <w:tcW w:w="1134" w:type="dxa"/>
+            <w:tcBorders>
+              <w:top w:val="single" w:sz="6" w:space="0" w:color="000000"/>
+              <w:left w:val="single" w:sz="6" w:space="0" w:color="000000"/>
+              <w:bottom w:val="single" w:sz="6" w:space="0" w:color="000000"/>
+              <w:right w:val="single" w:sz="6" w:space="0" w:color="000000"/>
+            </w:tcBorders>
+            <w:shd w:val="clear" w:color="auto" w:fill="FFFFFF"/>
+          </w:tcPr>
+          <w:p>
+            <w:pPr>
+              <w:tabs>
+                <w:tab w:val="left" w:pos="1068"/>
+              </w:tabs>
+              <w:rPr>
+                <w:b/>
+                <w:bCs/>
+              </w:rPr>
+            </w:pPr>
+            <w:r>
+              <w:rPr>
+                <w:b/>
+                <w:bCs/>
+              </w:rPr>
+              <w:t>Medium</w:t>
+            </w:r>
+          </w:p>
+        </w:tc>
+        <w:tc>
+          <w:tcPr>
+            <w:tcW w:w="851" w:type="dxa"/>
+            <w:tcBorders>
+              <w:top w:val="single" w:sz="6" w:space="0" w:color="000000"/>
+              <w:left w:val="single" w:sz="6" w:space="0" w:color="000000"/>
+              <w:bottom w:val="single" w:sz="6" w:space="0" w:color="000000"/>
+              <w:right w:val="single" w:sz="6" w:space="0" w:color="000000"/>
+            </w:tcBorders>
+            <w:shd w:val="clear" w:color="auto" w:fill="FFFFFF"/>
+          </w:tcPr>
+          <w:p>
+            <w:pPr>
+              <w:rPr>
+                <w:b/>
+                <w:bCs/>
+              </w:rPr>
+            </w:pPr>
+            <w:r>
+              <w:rPr>
+                <w:b/>
+                <w:bCs/>
+              </w:rPr>
+              <w:t>High</w:t>
+            </w:r>
+          </w:p>
+        </w:tc>
+        <w:tc>
+          <w:tcPr>
+            <w:tcW w:w="850" w:type="dxa"/>
+            <w:tcBorders>
+              <w:top w:val="single" w:sz="6" w:space="0" w:color="000000"/>
+              <w:left w:val="single" w:sz="6" w:space="0" w:color="000000"/>
+              <w:bottom w:val="single" w:sz="6" w:space="0" w:color="000000"/>
+              <w:right w:val="single" w:sz="6" w:space="0" w:color="000000"/>
+            </w:tcBorders>
+            <w:shd w:val="clear" w:color="auto" w:fill="FFFFFF"/>
+          </w:tcPr>
+          <w:p>
+            <w:pPr>
+              <w:rPr>
+                <w:b/>
+                <w:bCs/>
+              </w:rPr>
+            </w:pPr>
+            <w:r>
+              <w:rPr>
+                <w:b/>
+                <w:bCs/>
+              </w:rPr>
+              <w:t>High</w:t>
+            </w:r>
+          </w:p>
+        </w:tc>
+        <w:tc>
+          <w:tcPr>
+            <w:tcW w:w="1559" w:type="dxa"/>
+            <w:tcBorders>
+              <w:top w:val="single" w:sz="6" w:space="0" w:color="000000"/>
+              <w:left w:val="single" w:sz="6" w:space="0" w:color="000000"/>
+              <w:bottom w:val="single" w:sz="6" w:space="0" w:color="000000"/>
+              <w:right w:val="single" w:sz="6" w:space="0" w:color="000000"/>
+            </w:tcBorders>
+            <w:shd w:val="clear" w:color="auto" w:fill="FFFFFF"/>
+          </w:tcPr>
+          <w:p>
+            <w:pPr>
+              <w:rPr>
+                <w:b/>
+                <w:bCs/>
+              </w:rPr>
+            </w:pPr>
+            <w:r>
+              <w:rPr>
+                <w:b/>
+                <w:bCs/>
+              </w:rPr>
+              <w:t>Define and test RLS rules for requester, staff and management roles before relying on them.</w:t>
+            </w:r>
+          </w:p>
+        </w:tc>
+        <w:tc>
+          <w:tcPr>
+            <w:tcW w:w="1843" w:type="dxa"/>
+            <w:tcBorders>
+              <w:top w:val="single" w:sz="6" w:space="0" w:color="000000"/>
+              <w:left w:val="single" w:sz="6" w:space="0" w:color="000000"/>
+              <w:bottom w:val="single" w:sz="6" w:space="0" w:color="000000"/>
+              <w:right w:val="single" w:sz="6" w:space="0" w:color="000000"/>
+            </w:tcBorders>
+            <w:shd w:val="clear" w:color="auto" w:fill="FFFFFF"/>
+          </w:tcPr>
+          <w:p>
+            <w:pPr>
+              <w:rPr>
+                <w:b/>
+                <w:bCs/>
+              </w:rPr>
+            </w:pPr>
+            <w:r>
+              <w:rPr>
+                <w:b/>
+                <w:bCs/>
+              </w:rPr>
+              <w:t>Review and correct the affected rules and restrict access until the problem is fixed.</w:t>
+            </w:r>
+          </w:p>
+        </w:tc>
+        <w:tc>
+          <w:tcPr>
+            <w:tcW w:w="1559" w:type="dxa"/>
+            <w:tcBorders>
+              <w:top w:val="single" w:sz="6" w:space="0" w:color="000000"/>
+              <w:left w:val="single" w:sz="6" w:space="0" w:color="000000"/>
+              <w:bottom w:val="single" w:sz="6" w:space="0" w:color="000000"/>
+              <w:right w:val="single" w:sz="6" w:space="0" w:color="000000"/>
+            </w:tcBorders>
+            <w:shd w:val="clear" w:color="auto" w:fill="FFFFFF"/>
+          </w:tcPr>
+          <w:p>
+            <w:pPr>
+              <w:rPr>
+                <w:b/>
+                <w:bCs/>
+              </w:rPr>
+            </w:pPr>
+            <w:r>
+              <w:rPr>
+                <w:b/>
+                <w:bCs/>
+              </w:rPr>
+              <w:t>Project Team</w:t>
+            </w:r>
+          </w:p>
+        </w:tc>
+        <w:tc>
+          <w:tcPr>
+            <w:tcW w:w="851" w:type="dxa"/>
+            <w:tcBorders>
+              <w:top w:val="single" w:sz="6" w:space="0" w:color="000000"/>
+              <w:left w:val="single" w:sz="6" w:space="0" w:color="000000"/>
+              <w:bottom w:val="single" w:sz="6" w:space="0" w:color="000000"/>
+              <w:right w:val="single" w:sz="6" w:space="0" w:color="000000"/>
+            </w:tcBorders>
+            <w:shd w:val="clear" w:color="auto" w:fill="FFFFFF"/>
+          </w:tcPr>
+          <w:p>
+            <w:pPr>
+              <w:rPr>
+                <w:b/>
+                <w:bCs/>
+              </w:rPr>
+            </w:pPr>
+            <w:r>
+              <w:rPr>
+                <w:b/>
+                <w:bCs/>
+              </w:rPr>
+              <w:t>Open</w:t>
+            </w:r>
+          </w:p>
+        </w:tc>
+      </w:tr>
+      <w:tr>
+        <w:trPr>
+          <w:trHeight w:val="300"/>
+        </w:trPr>
+        <w:tc>
+          <w:tcPr>
+            <w:tcW w:w="812" w:type="dxa"/>
+            <w:tcBorders>
+              <w:top w:val="single" w:sz="6" w:space="0" w:color="000000"/>
+              <w:left w:val="single" w:sz="6" w:space="0" w:color="000000"/>
+              <w:bottom w:val="single" w:sz="6" w:space="0" w:color="000000"/>
+              <w:right w:val="single" w:sz="6" w:space="0" w:color="000000"/>
+            </w:tcBorders>
+            <w:shd w:val="clear" w:color="auto" w:fill="FFFFFF"/>
+          </w:tcPr>
+          <w:p>
+            <w:pPr>
+              <w:rPr>
+                <w:b/>
+                <w:bCs/>
+              </w:rPr>
+            </w:pPr>
+            <w:r>
+              <w:rPr>
+                <w:b/>
+                <w:bCs/>
+              </w:rPr>
+              <w:t>R-011</w:t>
+            </w:r>
+          </w:p>
+        </w:tc>
+        <w:tc>
+          <w:tcPr>
+            <w:tcW w:w="2299" w:type="dxa"/>
+            <w:tcBorders>
+              <w:top w:val="single" w:sz="6" w:space="0" w:color="000000"/>
+              <w:left w:val="single" w:sz="6" w:space="0" w:color="000000"/>
+              <w:bottom w:val="single" w:sz="6" w:space="0" w:color="000000"/>
+              <w:right w:val="single" w:sz="6" w:space="0" w:color="000000"/>
+            </w:tcBorders>
+            <w:shd w:val="clear" w:color="auto" w:fill="FFFFFF"/>
+          </w:tcPr>
+          <w:p>
+            <w:pPr>
+              <w:rPr>
+                <w:b/>
+                <w:bCs/>
+              </w:rPr>
+            </w:pPr>
+            <w:proofErr w:type="spellStart"/>
+            <w:r>
+              <w:rPr>
+                <w:b/>
+                <w:bCs/>
+              </w:rPr>
+              <w:t>Supabase</w:t>
+            </w:r>
+            <w:proofErr w:type="spellEnd"/>
+            <w:r>
+              <w:rPr>
+                <w:b/>
+                <w:bCs/>
+              </w:rPr>
+              <w:t xml:space="preserve"> may become unsuitable if </w:t>
+            </w:r>
+            <w:proofErr w:type="spellStart"/>
+            <w:r>
+              <w:rPr>
+                <w:b/>
+                <w:bCs/>
+              </w:rPr>
+              <w:t>CivicConnect</w:t>
+            </w:r>
+            <w:proofErr w:type="spellEnd"/>
+            <w:r>
+              <w:rPr>
+                <w:b/>
+                <w:bCs/>
+              </w:rPr>
+              <w:t xml:space="preserve"> later needs more complex backend processing.</w:t>
+            </w:r>
+          </w:p>
+        </w:tc>
+        <w:tc>
+          <w:tcPr>
+            <w:tcW w:w="2126" w:type="dxa"/>
+            <w:tcBorders>
+              <w:top w:val="single" w:sz="6" w:space="0" w:color="000000"/>
+              <w:left w:val="single" w:sz="6" w:space="0" w:color="000000"/>
+              <w:bottom w:val="single" w:sz="6" w:space="0" w:color="000000"/>
+              <w:right w:val="single" w:sz="6" w:space="0" w:color="000000"/>
+            </w:tcBorders>
+            <w:shd w:val="clear" w:color="auto" w:fill="FFFFFF"/>
+          </w:tcPr>
+          <w:p>
+            <w:pPr>
+              <w:rPr>
+                <w:b/>
+                <w:bCs/>
+              </w:rPr>
+            </w:pPr>
+            <w:r>
+              <w:rPr>
+                <w:b/>
+                <w:bCs/>
+              </w:rPr>
+              <w:t xml:space="preserve">The current stack assumes that the required backend features can be handled using </w:t>
+            </w:r>
+            <w:proofErr w:type="spellStart"/>
+            <w:r>
+              <w:rPr>
+                <w:b/>
+                <w:bCs/>
+              </w:rPr>
+              <w:t>Supabase</w:t>
+            </w:r>
+            <w:proofErr w:type="spellEnd"/>
+            <w:r>
+              <w:rPr>
+                <w:b/>
+                <w:bCs/>
+              </w:rPr>
+              <w:t>, PostgreSQL functions and Edge Functions where needed.</w:t>
+            </w:r>
+          </w:p>
+        </w:tc>
+        <w:tc>
+          <w:tcPr>
+            <w:tcW w:w="1134" w:type="dxa"/>
+            <w:tcBorders>
+              <w:top w:val="single" w:sz="6" w:space="0" w:color="000000"/>
+              <w:left w:val="single" w:sz="6" w:space="0" w:color="000000"/>
+              <w:bottom w:val="single" w:sz="6" w:space="0" w:color="000000"/>
+              <w:right w:val="single" w:sz="6" w:space="0" w:color="000000"/>
+            </w:tcBorders>
+            <w:shd w:val="clear" w:color="auto" w:fill="FFFFFF"/>
+          </w:tcPr>
+          <w:p>
+            <w:pPr>
+              <w:tabs>
+                <w:tab w:val="left" w:pos="1068"/>
+              </w:tabs>
+              <w:rPr>
+                <w:b/>
+                <w:bCs/>
+              </w:rPr>
+            </w:pPr>
+            <w:r>
+              <w:rPr>
+                <w:b/>
+                <w:bCs/>
+              </w:rPr>
+              <w:t>Low</w:t>
+            </w:r>
+          </w:p>
+        </w:tc>
+        <w:tc>
+          <w:tcPr>
+            <w:tcW w:w="851" w:type="dxa"/>
+            <w:tcBorders>
+              <w:top w:val="single" w:sz="6" w:space="0" w:color="000000"/>
+              <w:left w:val="single" w:sz="6" w:space="0" w:color="000000"/>
+              <w:bottom w:val="single" w:sz="6" w:space="0" w:color="000000"/>
+              <w:right w:val="single" w:sz="6" w:space="0" w:color="000000"/>
+            </w:tcBorders>
+            <w:shd w:val="clear" w:color="auto" w:fill="FFFFFF"/>
+          </w:tcPr>
+          <w:p>
+            <w:pPr>
+              <w:rPr>
+                <w:b/>
+                <w:bCs/>
+              </w:rPr>
+            </w:pPr>
+            <w:r>
+              <w:rPr>
+                <w:b/>
+                <w:bCs/>
+              </w:rPr>
+              <w:t>High</w:t>
+            </w:r>
+          </w:p>
+        </w:tc>
+        <w:tc>
+          <w:tcPr>
+            <w:tcW w:w="850" w:type="dxa"/>
+            <w:tcBorders>
+              <w:top w:val="single" w:sz="6" w:space="0" w:color="000000"/>
+              <w:left w:val="single" w:sz="6" w:space="0" w:color="000000"/>
+              <w:bottom w:val="single" w:sz="6" w:space="0" w:color="000000"/>
+              <w:right w:val="single" w:sz="6" w:space="0" w:color="000000"/>
+            </w:tcBorders>
+            <w:shd w:val="clear" w:color="auto" w:fill="FFFFFF"/>
+          </w:tcPr>
+          <w:p>
+            <w:pPr>
+              <w:rPr>
+                <w:b/>
+                <w:bCs/>
+              </w:rPr>
+            </w:pPr>
+            <w:r>
+              <w:rPr>
+                <w:b/>
+                <w:bCs/>
+              </w:rPr>
+              <w:t>Medium</w:t>
+            </w:r>
+          </w:p>
+        </w:tc>
+        <w:tc>
+          <w:tcPr>
+            <w:tcW w:w="1559" w:type="dxa"/>
+            <w:tcBorders>
+              <w:top w:val="single" w:sz="6" w:space="0" w:color="000000"/>
+              <w:left w:val="single" w:sz="6" w:space="0" w:color="000000"/>
+              <w:bottom w:val="single" w:sz="6" w:space="0" w:color="000000"/>
+              <w:right w:val="single" w:sz="6" w:space="0" w:color="000000"/>
+            </w:tcBorders>
+            <w:shd w:val="clear" w:color="auto" w:fill="FFFFFF"/>
+          </w:tcPr>
+          <w:p>
+            <w:pPr>
+              <w:rPr>
+                <w:b/>
+                <w:bCs/>
+              </w:rPr>
+            </w:pPr>
+            <w:r>
+              <w:rPr>
+                <w:b/>
+                <w:bCs/>
+              </w:rPr>
+              <w:t>Review backend requirements as development continues and document the decision in ADR-001.</w:t>
+            </w:r>
+          </w:p>
+        </w:tc>
+        <w:tc>
+          <w:tcPr>
+            <w:tcW w:w="1843" w:type="dxa"/>
+            <w:tcBorders>
+              <w:top w:val="single" w:sz="6" w:space="0" w:color="000000"/>
+              <w:left w:val="single" w:sz="6" w:space="0" w:color="000000"/>
+              <w:bottom w:val="single" w:sz="6" w:space="0" w:color="000000"/>
+              <w:right w:val="single" w:sz="6" w:space="0" w:color="000000"/>
+            </w:tcBorders>
+            <w:shd w:val="clear" w:color="auto" w:fill="FFFFFF"/>
+          </w:tcPr>
+          <w:p>
+            <w:pPr>
+              <w:rPr>
+                <w:b/>
+                <w:bCs/>
+              </w:rPr>
+            </w:pPr>
+            <w:r>
+              <w:rPr>
+                <w:b/>
+                <w:bCs/>
+              </w:rPr>
+              <w:t>Reconsider the backend and introduce Node.js/Express if later requirements justify it.</w:t>
+            </w:r>
+          </w:p>
+        </w:tc>
+        <w:tc>
+          <w:tcPr>
+            <w:tcW w:w="1559" w:type="dxa"/>
+            <w:tcBorders>
+              <w:top w:val="single" w:sz="6" w:space="0" w:color="000000"/>
+              <w:left w:val="single" w:sz="6" w:space="0" w:color="000000"/>
+              <w:bottom w:val="single" w:sz="6" w:space="0" w:color="000000"/>
+              <w:right w:val="single" w:sz="6" w:space="0" w:color="000000"/>
+            </w:tcBorders>
+            <w:shd w:val="clear" w:color="auto" w:fill="FFFFFF"/>
+          </w:tcPr>
+          <w:p>
+            <w:pPr>
+              <w:rPr>
+                <w:b/>
+                <w:bCs/>
+              </w:rPr>
+            </w:pPr>
+            <w:r>
+              <w:rPr>
+                <w:b/>
+                <w:bCs/>
+              </w:rPr>
+              <w:t>Project Team</w:t>
+            </w:r>
+          </w:p>
+        </w:tc>
+        <w:tc>
+          <w:tcPr>
+            <w:tcW w:w="851" w:type="dxa"/>
+            <w:tcBorders>
+              <w:top w:val="single" w:sz="6" w:space="0" w:color="000000"/>
+              <w:left w:val="single" w:sz="6" w:space="0" w:color="000000"/>
+              <w:bottom w:val="single" w:sz="6" w:space="0" w:color="000000"/>
+              <w:right w:val="single" w:sz="6" w:space="0" w:color="000000"/>
+            </w:tcBorders>
+            <w:shd w:val="clear" w:color="auto" w:fill="FFFFFF"/>
+          </w:tcPr>
+          <w:p>
+            <w:pPr>
+              <w:rPr>
+                <w:b/>
+                <w:bCs/>
+              </w:rPr>
+            </w:pPr>
+            <w:r>
+              <w:rPr>
+                <w:b/>
+                <w:bCs/>
+              </w:rPr>
+              <w:t>Open</w:t>
+            </w:r>
+          </w:p>
+        </w:tc>
+      </w:tr>
+      <w:tr>
+        <w:trPr>
+          <w:trHeight w:val="300"/>
+        </w:trPr>
+        <w:tc>
+          <w:tcPr>
+            <w:tcW w:w="812" w:type="dxa"/>
+            <w:tcBorders>
+              <w:top w:val="single" w:sz="6" w:space="0" w:color="000000"/>
+              <w:left w:val="single" w:sz="6" w:space="0" w:color="000000"/>
+              <w:bottom w:val="single" w:sz="6" w:space="0" w:color="000000"/>
+              <w:right w:val="single" w:sz="6" w:space="0" w:color="000000"/>
+            </w:tcBorders>
+            <w:shd w:val="clear" w:color="auto" w:fill="FFFFFF"/>
+          </w:tcPr>
+          <w:p>
+            <w:pPr>
+              <w:rPr>
+                <w:b/>
+                <w:bCs/>
+              </w:rPr>
+            </w:pPr>
+            <w:r>
+              <w:rPr>
+                <w:b/>
+                <w:bCs/>
+              </w:rPr>
+              <w:t>R-012</w:t>
+            </w:r>
+          </w:p>
+        </w:tc>
+        <w:tc>
+          <w:tcPr>
+            <w:tcW w:w="2299" w:type="dxa"/>
+            <w:tcBorders>
+              <w:top w:val="single" w:sz="6" w:space="0" w:color="000000"/>
+              <w:left w:val="single" w:sz="6" w:space="0" w:color="000000"/>
+              <w:bottom w:val="single" w:sz="6" w:space="0" w:color="000000"/>
+              <w:right w:val="single" w:sz="6" w:space="0" w:color="000000"/>
+            </w:tcBorders>
+            <w:shd w:val="clear" w:color="auto" w:fill="FFFFFF"/>
+          </w:tcPr>
+          <w:p>
+            <w:pPr>
+              <w:rPr>
+                <w:b/>
+                <w:bCs/>
+              </w:rPr>
+            </w:pPr>
+            <w:r>
+              <w:rPr>
+                <w:b/>
+                <w:bCs/>
+              </w:rPr>
+              <w:t>Dependency or version problems could cause development, build or testing failures.</w:t>
+            </w:r>
+          </w:p>
+        </w:tc>
+        <w:tc>
+          <w:tcPr>
+            <w:tcW w:w="2126" w:type="dxa"/>
+            <w:tcBorders>
+              <w:top w:val="single" w:sz="6" w:space="0" w:color="000000"/>
+              <w:left w:val="single" w:sz="6" w:space="0" w:color="000000"/>
+              <w:bottom w:val="single" w:sz="6" w:space="0" w:color="000000"/>
+              <w:right w:val="single" w:sz="6" w:space="0" w:color="000000"/>
+            </w:tcBorders>
+            <w:shd w:val="clear" w:color="auto" w:fill="FFFFFF"/>
+          </w:tcPr>
+          <w:p>
+            <w:pPr>
+              <w:rPr>
+                <w:b/>
+                <w:bCs/>
+              </w:rPr>
+            </w:pPr>
+            <w:r>
+              <w:rPr>
+                <w:b/>
+                <w:bCs/>
+              </w:rPr>
+              <w:t xml:space="preserve">React, Vite, Node.js, </w:t>
+            </w:r>
+            <w:proofErr w:type="spellStart"/>
+            <w:r>
+              <w:rPr>
+                <w:b/>
+                <w:bCs/>
+              </w:rPr>
+              <w:t>Vitest</w:t>
+            </w:r>
+            <w:proofErr w:type="spellEnd"/>
+            <w:r>
+              <w:rPr>
+                <w:b/>
+                <w:bCs/>
+              </w:rPr>
+              <w:t xml:space="preserve"> and other project dependencies have version requirements that </w:t>
+            </w:r>
+            <w:r>
+              <w:rPr>
+                <w:b/>
+                <w:bCs/>
+              </w:rPr>
+              <w:lastRenderedPageBreak/>
+              <w:t>must remain compatible.</w:t>
+            </w:r>
+          </w:p>
+        </w:tc>
+        <w:tc>
+          <w:tcPr>
+            <w:tcW w:w="1134" w:type="dxa"/>
+            <w:tcBorders>
+              <w:top w:val="single" w:sz="6" w:space="0" w:color="000000"/>
+              <w:left w:val="single" w:sz="6" w:space="0" w:color="000000"/>
+              <w:bottom w:val="single" w:sz="6" w:space="0" w:color="000000"/>
+              <w:right w:val="single" w:sz="6" w:space="0" w:color="000000"/>
+            </w:tcBorders>
+            <w:shd w:val="clear" w:color="auto" w:fill="FFFFFF"/>
+          </w:tcPr>
+          <w:p>
+            <w:pPr>
+              <w:tabs>
+                <w:tab w:val="left" w:pos="1068"/>
+              </w:tabs>
+              <w:rPr>
+                <w:b/>
+                <w:bCs/>
+              </w:rPr>
+            </w:pPr>
+            <w:r>
+              <w:rPr>
+                <w:b/>
+                <w:bCs/>
+              </w:rPr>
+              <w:lastRenderedPageBreak/>
+              <w:t>Medium</w:t>
+            </w:r>
+          </w:p>
+        </w:tc>
+        <w:tc>
+          <w:tcPr>
+            <w:tcW w:w="851" w:type="dxa"/>
+            <w:tcBorders>
+              <w:top w:val="single" w:sz="6" w:space="0" w:color="000000"/>
+              <w:left w:val="single" w:sz="6" w:space="0" w:color="000000"/>
+              <w:bottom w:val="single" w:sz="6" w:space="0" w:color="000000"/>
+              <w:right w:val="single" w:sz="6" w:space="0" w:color="000000"/>
+            </w:tcBorders>
+            <w:shd w:val="clear" w:color="auto" w:fill="FFFFFF"/>
+          </w:tcPr>
+          <w:p>
+            <w:pPr>
+              <w:rPr>
+                <w:b/>
+                <w:bCs/>
+              </w:rPr>
+            </w:pPr>
+            <w:r>
+              <w:rPr>
+                <w:b/>
+                <w:bCs/>
+              </w:rPr>
+              <w:t>Medium</w:t>
+            </w:r>
+          </w:p>
+        </w:tc>
+        <w:tc>
+          <w:tcPr>
+            <w:tcW w:w="850" w:type="dxa"/>
+            <w:tcBorders>
+              <w:top w:val="single" w:sz="6" w:space="0" w:color="000000"/>
+              <w:left w:val="single" w:sz="6" w:space="0" w:color="000000"/>
+              <w:bottom w:val="single" w:sz="6" w:space="0" w:color="000000"/>
+              <w:right w:val="single" w:sz="6" w:space="0" w:color="000000"/>
+            </w:tcBorders>
+            <w:shd w:val="clear" w:color="auto" w:fill="FFFFFF"/>
+          </w:tcPr>
+          <w:p>
+            <w:pPr>
+              <w:rPr>
+                <w:b/>
+                <w:bCs/>
+              </w:rPr>
+            </w:pPr>
+            <w:r>
+              <w:rPr>
+                <w:b/>
+                <w:bCs/>
+              </w:rPr>
+              <w:t>Medium</w:t>
+            </w:r>
+          </w:p>
+        </w:tc>
+        <w:tc>
+          <w:tcPr>
+            <w:tcW w:w="1559" w:type="dxa"/>
+            <w:tcBorders>
+              <w:top w:val="single" w:sz="6" w:space="0" w:color="000000"/>
+              <w:left w:val="single" w:sz="6" w:space="0" w:color="000000"/>
+              <w:bottom w:val="single" w:sz="6" w:space="0" w:color="000000"/>
+              <w:right w:val="single" w:sz="6" w:space="0" w:color="000000"/>
+            </w:tcBorders>
+            <w:shd w:val="clear" w:color="auto" w:fill="FFFFFF"/>
+          </w:tcPr>
+          <w:p>
+            <w:pPr>
+              <w:rPr>
+                <w:b/>
+                <w:bCs/>
+              </w:rPr>
+            </w:pPr>
+            <w:r>
+              <w:rPr>
+                <w:b/>
+                <w:bCs/>
+              </w:rPr>
+              <w:t>Use compatible versions, lock dependencies and use CI to check changes.</w:t>
+            </w:r>
+          </w:p>
+        </w:tc>
+        <w:tc>
+          <w:tcPr>
+            <w:tcW w:w="1843" w:type="dxa"/>
+            <w:tcBorders>
+              <w:top w:val="single" w:sz="6" w:space="0" w:color="000000"/>
+              <w:left w:val="single" w:sz="6" w:space="0" w:color="000000"/>
+              <w:bottom w:val="single" w:sz="6" w:space="0" w:color="000000"/>
+              <w:right w:val="single" w:sz="6" w:space="0" w:color="000000"/>
+            </w:tcBorders>
+            <w:shd w:val="clear" w:color="auto" w:fill="FFFFFF"/>
+          </w:tcPr>
+          <w:p>
+            <w:pPr>
+              <w:rPr>
+                <w:b/>
+                <w:bCs/>
+              </w:rPr>
+            </w:pPr>
+            <w:r>
+              <w:rPr>
+                <w:b/>
+                <w:bCs/>
+              </w:rPr>
+              <w:t xml:space="preserve">Update or roll back incompatible dependencies and rerun the required tests </w:t>
+            </w:r>
+            <w:r>
+              <w:rPr>
+                <w:b/>
+                <w:bCs/>
+              </w:rPr>
+              <w:lastRenderedPageBreak/>
+              <w:t>before integration.</w:t>
+            </w:r>
+          </w:p>
+        </w:tc>
+        <w:tc>
+          <w:tcPr>
+            <w:tcW w:w="1559" w:type="dxa"/>
+            <w:tcBorders>
+              <w:top w:val="single" w:sz="6" w:space="0" w:color="000000"/>
+              <w:left w:val="single" w:sz="6" w:space="0" w:color="000000"/>
+              <w:bottom w:val="single" w:sz="6" w:space="0" w:color="000000"/>
+              <w:right w:val="single" w:sz="6" w:space="0" w:color="000000"/>
+            </w:tcBorders>
+            <w:shd w:val="clear" w:color="auto" w:fill="FFFFFF"/>
+          </w:tcPr>
+          <w:p>
+            <w:pPr>
+              <w:rPr>
+                <w:b/>
+                <w:bCs/>
+              </w:rPr>
+            </w:pPr>
+            <w:r>
+              <w:rPr>
+                <w:b/>
+                <w:bCs/>
+              </w:rPr>
+              <w:lastRenderedPageBreak/>
+              <w:t>Project Team</w:t>
+            </w:r>
+          </w:p>
+        </w:tc>
+        <w:tc>
+          <w:tcPr>
+            <w:tcW w:w="851" w:type="dxa"/>
+            <w:tcBorders>
+              <w:top w:val="single" w:sz="6" w:space="0" w:color="000000"/>
+              <w:left w:val="single" w:sz="6" w:space="0" w:color="000000"/>
+              <w:bottom w:val="single" w:sz="6" w:space="0" w:color="000000"/>
+              <w:right w:val="single" w:sz="6" w:space="0" w:color="000000"/>
+            </w:tcBorders>
+            <w:shd w:val="clear" w:color="auto" w:fill="FFFFFF"/>
+          </w:tcPr>
+          <w:p>
             <w:r>
               <w:rPr>
                 <w:b/>
@@ -4785,7 +5736,6 @@
   <w:style w:type="character" w:default="1" w:styleId="DefaultParagraphFont">
     <w:name w:val="Default Paragraph Font"/>
     <w:uiPriority w:val="1"/>
-    <w:semiHidden/>
     <w:unhideWhenUsed/>
   </w:style>
   <w:style w:type="table" w:default="1" w:styleId="TableNormal">

</xml_diff>

<commit_message>
M2-11: document deployment compatibility and environment direction
</commit_message>
<xml_diff>
--- a/docs/risk/Risk Register.docx
+++ b/docs/risk/Risk Register.docx
@@ -1536,23 +1536,7 @@
                 <w:b/>
                 <w:bCs/>
               </w:rPr>
-              <w:t xml:space="preserve">Team may become too ambitious in defining the scope </w:t>
-            </w:r>
-            <w:proofErr w:type="gramStart"/>
-            <w:r>
-              <w:rPr>
-                <w:b/>
-                <w:bCs/>
-              </w:rPr>
-              <w:t>so as to</w:t>
-            </w:r>
-            <w:proofErr w:type="gramEnd"/>
-            <w:r>
-              <w:rPr>
-                <w:b/>
-                <w:bCs/>
-              </w:rPr>
-              <w:t xml:space="preserve"> create too much work resulting in the project not being able to be </w:t>
+              <w:t xml:space="preserve">Team may become too ambitious in defining the scope so as to create too much work resulting in the project not being able to be </w:t>
             </w:r>
             <w:r>
               <w:rPr>
@@ -1678,23 +1662,7 @@
                 <w:bCs/>
               </w:rPr>
               <w:lastRenderedPageBreak/>
-              <w:t xml:space="preserve">requirements. Such as </w:t>
-            </w:r>
-            <w:proofErr w:type="gramStart"/>
-            <w:r>
-              <w:rPr>
-                <w:b/>
-                <w:bCs/>
-              </w:rPr>
-              <w:t>a</w:t>
-            </w:r>
-            <w:proofErr w:type="gramEnd"/>
-            <w:r>
-              <w:rPr>
-                <w:b/>
-                <w:bCs/>
-              </w:rPr>
-              <w:t xml:space="preserve"> MVP (Minimal Viable Product) If this is noticed to be achievable during later stages improvement of scope to enhance product with nice to haves can be considered under strict change control processes.</w:t>
+              <w:t>requirements. Such as a MVP (Minimal Viable Product) If this is noticed to be achievable during later stages improvement of scope to enhance product with nice to haves can be considered under strict change control processes.</w:t>
             </w:r>
           </w:p>
         </w:tc>
@@ -3596,23 +3564,7 @@
                 <w:bCs/>
               </w:rPr>
               <w:lastRenderedPageBreak/>
-              <w:t xml:space="preserve">Stakeholders might lack the resources to access </w:t>
-            </w:r>
-            <w:proofErr w:type="gramStart"/>
-            <w:r>
-              <w:rPr>
-                <w:b/>
-                <w:bCs/>
-              </w:rPr>
-              <w:t>platform</w:t>
-            </w:r>
-            <w:proofErr w:type="gramEnd"/>
-            <w:r>
-              <w:rPr>
-                <w:b/>
-                <w:bCs/>
-              </w:rPr>
-              <w:t xml:space="preserve"> and </w:t>
+              <w:t xml:space="preserve">Stakeholders might lack the resources to access platform and </w:t>
             </w:r>
             <w:r>
               <w:rPr>
@@ -4044,23 +3996,7 @@
                 <w:b/>
                 <w:bCs/>
               </w:rPr>
-              <w:t xml:space="preserve"> makes it that work needs to have two reviewers who </w:t>
-            </w:r>
-            <w:proofErr w:type="gramStart"/>
-            <w:r>
-              <w:rPr>
-                <w:b/>
-                <w:bCs/>
-              </w:rPr>
-              <w:t>have to</w:t>
-            </w:r>
-            <w:proofErr w:type="gramEnd"/>
-            <w:r>
-              <w:rPr>
-                <w:b/>
-                <w:bCs/>
-              </w:rPr>
-              <w:t xml:space="preserve"> sign off on the merge so this can be detected and </w:t>
+              <w:t xml:space="preserve"> makes it that work needs to have two reviewers who have to sign off on the merge so this can be detected and </w:t>
             </w:r>
             <w:r>
               <w:rPr>
@@ -4152,6 +4088,2150 @@
               </w:rPr>
               <w:t>Open</w:t>
             </w:r>
+          </w:p>
+        </w:tc>
+      </w:tr>
+      <w:tr>
+        <w:trPr>
+          <w:trHeight w:val="300"/>
+        </w:trPr>
+        <w:tc>
+          <w:tcPr>
+            <w:tcW w:w="812" w:type="dxa"/>
+            <w:tcBorders>
+              <w:top w:val="single" w:sz="6" w:space="0" w:color="000000"/>
+              <w:left w:val="single" w:sz="6" w:space="0" w:color="000000"/>
+              <w:bottom w:val="single" w:sz="6" w:space="0" w:color="000000"/>
+              <w:right w:val="single" w:sz="6" w:space="0" w:color="000000"/>
+            </w:tcBorders>
+            <w:shd w:val="clear" w:color="auto" w:fill="FFFFFF"/>
+          </w:tcPr>
+          <w:p>
+            <w:pPr>
+              <w:rPr>
+                <w:b/>
+                <w:bCs/>
+              </w:rPr>
+            </w:pPr>
+            <w:r>
+              <w:rPr>
+                <w:b/>
+                <w:bCs/>
+              </w:rPr>
+              <w:t>R-010</w:t>
+            </w:r>
+          </w:p>
+        </w:tc>
+        <w:tc>
+          <w:tcPr>
+            <w:tcW w:w="2299" w:type="dxa"/>
+            <w:tcBorders>
+              <w:top w:val="single" w:sz="6" w:space="0" w:color="000000"/>
+              <w:left w:val="single" w:sz="6" w:space="0" w:color="000000"/>
+              <w:bottom w:val="single" w:sz="6" w:space="0" w:color="000000"/>
+              <w:right w:val="single" w:sz="6" w:space="0" w:color="000000"/>
+            </w:tcBorders>
+            <w:shd w:val="clear" w:color="auto" w:fill="FFFFFF"/>
+          </w:tcPr>
+          <w:p>
+            <w:pPr>
+              <w:rPr>
+                <w:b/>
+                <w:bCs/>
+              </w:rPr>
+            </w:pPr>
+          </w:p>
+        </w:tc>
+        <w:tc>
+          <w:tcPr>
+            <w:tcW w:w="2126" w:type="dxa"/>
+            <w:tcBorders>
+              <w:top w:val="single" w:sz="6" w:space="0" w:color="000000"/>
+              <w:left w:val="single" w:sz="6" w:space="0" w:color="000000"/>
+              <w:bottom w:val="single" w:sz="6" w:space="0" w:color="000000"/>
+              <w:right w:val="single" w:sz="6" w:space="0" w:color="000000"/>
+            </w:tcBorders>
+            <w:shd w:val="clear" w:color="auto" w:fill="FFFFFF"/>
+          </w:tcPr>
+          <w:p>
+            <w:pPr>
+              <w:rPr>
+                <w:b/>
+                <w:bCs/>
+              </w:rPr>
+            </w:pPr>
+          </w:p>
+        </w:tc>
+        <w:tc>
+          <w:tcPr>
+            <w:tcW w:w="1134" w:type="dxa"/>
+            <w:tcBorders>
+              <w:top w:val="single" w:sz="6" w:space="0" w:color="000000"/>
+              <w:left w:val="single" w:sz="6" w:space="0" w:color="000000"/>
+              <w:bottom w:val="single" w:sz="6" w:space="0" w:color="000000"/>
+              <w:right w:val="single" w:sz="6" w:space="0" w:color="000000"/>
+            </w:tcBorders>
+            <w:shd w:val="clear" w:color="auto" w:fill="FFFFFF"/>
+          </w:tcPr>
+          <w:p>
+            <w:pPr>
+              <w:tabs>
+                <w:tab w:val="left" w:pos="1068"/>
+              </w:tabs>
+              <w:rPr>
+                <w:b/>
+                <w:bCs/>
+              </w:rPr>
+            </w:pPr>
+          </w:p>
+        </w:tc>
+        <w:tc>
+          <w:tcPr>
+            <w:tcW w:w="851" w:type="dxa"/>
+            <w:tcBorders>
+              <w:top w:val="single" w:sz="6" w:space="0" w:color="000000"/>
+              <w:left w:val="single" w:sz="6" w:space="0" w:color="000000"/>
+              <w:bottom w:val="single" w:sz="6" w:space="0" w:color="000000"/>
+              <w:right w:val="single" w:sz="6" w:space="0" w:color="000000"/>
+            </w:tcBorders>
+            <w:shd w:val="clear" w:color="auto" w:fill="FFFFFF"/>
+          </w:tcPr>
+          <w:p>
+            <w:pPr>
+              <w:rPr>
+                <w:b/>
+                <w:bCs/>
+              </w:rPr>
+            </w:pPr>
+          </w:p>
+        </w:tc>
+        <w:tc>
+          <w:tcPr>
+            <w:tcW w:w="850" w:type="dxa"/>
+            <w:tcBorders>
+              <w:top w:val="single" w:sz="6" w:space="0" w:color="000000"/>
+              <w:left w:val="single" w:sz="6" w:space="0" w:color="000000"/>
+              <w:bottom w:val="single" w:sz="6" w:space="0" w:color="000000"/>
+              <w:right w:val="single" w:sz="6" w:space="0" w:color="000000"/>
+            </w:tcBorders>
+            <w:shd w:val="clear" w:color="auto" w:fill="FFFFFF"/>
+          </w:tcPr>
+          <w:p>
+            <w:pPr>
+              <w:rPr>
+                <w:b/>
+                <w:bCs/>
+              </w:rPr>
+            </w:pPr>
+          </w:p>
+        </w:tc>
+        <w:tc>
+          <w:tcPr>
+            <w:tcW w:w="1559" w:type="dxa"/>
+            <w:tcBorders>
+              <w:top w:val="single" w:sz="6" w:space="0" w:color="000000"/>
+              <w:left w:val="single" w:sz="6" w:space="0" w:color="000000"/>
+              <w:bottom w:val="single" w:sz="6" w:space="0" w:color="000000"/>
+              <w:right w:val="single" w:sz="6" w:space="0" w:color="000000"/>
+            </w:tcBorders>
+            <w:shd w:val="clear" w:color="auto" w:fill="FFFFFF"/>
+          </w:tcPr>
+          <w:p>
+            <w:pPr>
+              <w:rPr>
+                <w:b/>
+                <w:bCs/>
+              </w:rPr>
+            </w:pPr>
+          </w:p>
+        </w:tc>
+        <w:tc>
+          <w:tcPr>
+            <w:tcW w:w="1843" w:type="dxa"/>
+            <w:tcBorders>
+              <w:top w:val="single" w:sz="6" w:space="0" w:color="000000"/>
+              <w:left w:val="single" w:sz="6" w:space="0" w:color="000000"/>
+              <w:bottom w:val="single" w:sz="6" w:space="0" w:color="000000"/>
+              <w:right w:val="single" w:sz="6" w:space="0" w:color="000000"/>
+            </w:tcBorders>
+            <w:shd w:val="clear" w:color="auto" w:fill="FFFFFF"/>
+          </w:tcPr>
+          <w:p>
+            <w:pPr>
+              <w:rPr>
+                <w:b/>
+                <w:bCs/>
+              </w:rPr>
+            </w:pPr>
+          </w:p>
+        </w:tc>
+        <w:tc>
+          <w:tcPr>
+            <w:tcW w:w="1559" w:type="dxa"/>
+            <w:tcBorders>
+              <w:top w:val="single" w:sz="6" w:space="0" w:color="000000"/>
+              <w:left w:val="single" w:sz="6" w:space="0" w:color="000000"/>
+              <w:bottom w:val="single" w:sz="6" w:space="0" w:color="000000"/>
+              <w:right w:val="single" w:sz="6" w:space="0" w:color="000000"/>
+            </w:tcBorders>
+            <w:shd w:val="clear" w:color="auto" w:fill="FFFFFF"/>
+          </w:tcPr>
+          <w:p>
+            <w:pPr>
+              <w:rPr>
+                <w:b/>
+                <w:bCs/>
+              </w:rPr>
+            </w:pPr>
+            <w:r>
+              <w:rPr>
+                <w:b/>
+                <w:bCs/>
+              </w:rPr>
+              <w:t>Project Team</w:t>
+            </w:r>
+          </w:p>
+        </w:tc>
+        <w:tc>
+          <w:tcPr>
+            <w:tcW w:w="851" w:type="dxa"/>
+            <w:tcBorders>
+              <w:top w:val="single" w:sz="6" w:space="0" w:color="000000"/>
+              <w:left w:val="single" w:sz="6" w:space="0" w:color="000000"/>
+              <w:bottom w:val="single" w:sz="6" w:space="0" w:color="000000"/>
+              <w:right w:val="single" w:sz="6" w:space="0" w:color="000000"/>
+            </w:tcBorders>
+            <w:shd w:val="clear" w:color="auto" w:fill="FFFFFF"/>
+          </w:tcPr>
+          <w:p>
+            <w:pPr>
+              <w:rPr>
+                <w:b/>
+                <w:bCs/>
+              </w:rPr>
+            </w:pPr>
+            <w:r>
+              <w:rPr>
+                <w:b/>
+                <w:bCs/>
+              </w:rPr>
+              <w:t>Open</w:t>
+            </w:r>
+          </w:p>
+        </w:tc>
+      </w:tr>
+      <w:tr>
+        <w:trPr>
+          <w:trHeight w:val="300"/>
+        </w:trPr>
+        <w:tc>
+          <w:tcPr>
+            <w:tcW w:w="812" w:type="dxa"/>
+            <w:tcBorders>
+              <w:top w:val="single" w:sz="6" w:space="0" w:color="000000"/>
+              <w:left w:val="single" w:sz="6" w:space="0" w:color="000000"/>
+              <w:bottom w:val="single" w:sz="6" w:space="0" w:color="000000"/>
+              <w:right w:val="single" w:sz="6" w:space="0" w:color="000000"/>
+            </w:tcBorders>
+            <w:shd w:val="clear" w:color="auto" w:fill="FFFFFF"/>
+          </w:tcPr>
+          <w:p>
+            <w:pPr>
+              <w:rPr>
+                <w:b/>
+                <w:bCs/>
+              </w:rPr>
+            </w:pPr>
+            <w:r>
+              <w:rPr>
+                <w:b/>
+                <w:bCs/>
+              </w:rPr>
+              <w:t>R-01</w:t>
+            </w:r>
+            <w:r>
+              <w:rPr>
+                <w:b/>
+                <w:bCs/>
+              </w:rPr>
+              <w:t>1</w:t>
+            </w:r>
+          </w:p>
+        </w:tc>
+        <w:tc>
+          <w:tcPr>
+            <w:tcW w:w="2299" w:type="dxa"/>
+            <w:tcBorders>
+              <w:top w:val="single" w:sz="6" w:space="0" w:color="000000"/>
+              <w:left w:val="single" w:sz="6" w:space="0" w:color="000000"/>
+              <w:bottom w:val="single" w:sz="6" w:space="0" w:color="000000"/>
+              <w:right w:val="single" w:sz="6" w:space="0" w:color="000000"/>
+            </w:tcBorders>
+            <w:shd w:val="clear" w:color="auto" w:fill="FFFFFF"/>
+          </w:tcPr>
+          <w:p>
+            <w:pPr>
+              <w:rPr>
+                <w:b/>
+                <w:bCs/>
+              </w:rPr>
+            </w:pPr>
+          </w:p>
+        </w:tc>
+        <w:tc>
+          <w:tcPr>
+            <w:tcW w:w="2126" w:type="dxa"/>
+            <w:tcBorders>
+              <w:top w:val="single" w:sz="6" w:space="0" w:color="000000"/>
+              <w:left w:val="single" w:sz="6" w:space="0" w:color="000000"/>
+              <w:bottom w:val="single" w:sz="6" w:space="0" w:color="000000"/>
+              <w:right w:val="single" w:sz="6" w:space="0" w:color="000000"/>
+            </w:tcBorders>
+            <w:shd w:val="clear" w:color="auto" w:fill="FFFFFF"/>
+          </w:tcPr>
+          <w:p>
+            <w:pPr>
+              <w:rPr>
+                <w:b/>
+                <w:bCs/>
+              </w:rPr>
+            </w:pPr>
+          </w:p>
+        </w:tc>
+        <w:tc>
+          <w:tcPr>
+            <w:tcW w:w="1134" w:type="dxa"/>
+            <w:tcBorders>
+              <w:top w:val="single" w:sz="6" w:space="0" w:color="000000"/>
+              <w:left w:val="single" w:sz="6" w:space="0" w:color="000000"/>
+              <w:bottom w:val="single" w:sz="6" w:space="0" w:color="000000"/>
+              <w:right w:val="single" w:sz="6" w:space="0" w:color="000000"/>
+            </w:tcBorders>
+            <w:shd w:val="clear" w:color="auto" w:fill="FFFFFF"/>
+          </w:tcPr>
+          <w:p>
+            <w:pPr>
+              <w:tabs>
+                <w:tab w:val="left" w:pos="1068"/>
+              </w:tabs>
+              <w:rPr>
+                <w:b/>
+                <w:bCs/>
+              </w:rPr>
+            </w:pPr>
+          </w:p>
+        </w:tc>
+        <w:tc>
+          <w:tcPr>
+            <w:tcW w:w="851" w:type="dxa"/>
+            <w:tcBorders>
+              <w:top w:val="single" w:sz="6" w:space="0" w:color="000000"/>
+              <w:left w:val="single" w:sz="6" w:space="0" w:color="000000"/>
+              <w:bottom w:val="single" w:sz="6" w:space="0" w:color="000000"/>
+              <w:right w:val="single" w:sz="6" w:space="0" w:color="000000"/>
+            </w:tcBorders>
+            <w:shd w:val="clear" w:color="auto" w:fill="FFFFFF"/>
+          </w:tcPr>
+          <w:p>
+            <w:pPr>
+              <w:rPr>
+                <w:b/>
+                <w:bCs/>
+              </w:rPr>
+            </w:pPr>
+          </w:p>
+        </w:tc>
+        <w:tc>
+          <w:tcPr>
+            <w:tcW w:w="850" w:type="dxa"/>
+            <w:tcBorders>
+              <w:top w:val="single" w:sz="6" w:space="0" w:color="000000"/>
+              <w:left w:val="single" w:sz="6" w:space="0" w:color="000000"/>
+              <w:bottom w:val="single" w:sz="6" w:space="0" w:color="000000"/>
+              <w:right w:val="single" w:sz="6" w:space="0" w:color="000000"/>
+            </w:tcBorders>
+            <w:shd w:val="clear" w:color="auto" w:fill="FFFFFF"/>
+          </w:tcPr>
+          <w:p>
+            <w:pPr>
+              <w:rPr>
+                <w:b/>
+                <w:bCs/>
+              </w:rPr>
+            </w:pPr>
+          </w:p>
+        </w:tc>
+        <w:tc>
+          <w:tcPr>
+            <w:tcW w:w="1559" w:type="dxa"/>
+            <w:tcBorders>
+              <w:top w:val="single" w:sz="6" w:space="0" w:color="000000"/>
+              <w:left w:val="single" w:sz="6" w:space="0" w:color="000000"/>
+              <w:bottom w:val="single" w:sz="6" w:space="0" w:color="000000"/>
+              <w:right w:val="single" w:sz="6" w:space="0" w:color="000000"/>
+            </w:tcBorders>
+            <w:shd w:val="clear" w:color="auto" w:fill="FFFFFF"/>
+          </w:tcPr>
+          <w:p>
+            <w:pPr>
+              <w:rPr>
+                <w:b/>
+                <w:bCs/>
+              </w:rPr>
+            </w:pPr>
+          </w:p>
+        </w:tc>
+        <w:tc>
+          <w:tcPr>
+            <w:tcW w:w="1843" w:type="dxa"/>
+            <w:tcBorders>
+              <w:top w:val="single" w:sz="6" w:space="0" w:color="000000"/>
+              <w:left w:val="single" w:sz="6" w:space="0" w:color="000000"/>
+              <w:bottom w:val="single" w:sz="6" w:space="0" w:color="000000"/>
+              <w:right w:val="single" w:sz="6" w:space="0" w:color="000000"/>
+            </w:tcBorders>
+            <w:shd w:val="clear" w:color="auto" w:fill="FFFFFF"/>
+          </w:tcPr>
+          <w:p>
+            <w:pPr>
+              <w:rPr>
+                <w:b/>
+                <w:bCs/>
+              </w:rPr>
+            </w:pPr>
+          </w:p>
+        </w:tc>
+        <w:tc>
+          <w:tcPr>
+            <w:tcW w:w="1559" w:type="dxa"/>
+            <w:tcBorders>
+              <w:top w:val="single" w:sz="6" w:space="0" w:color="000000"/>
+              <w:left w:val="single" w:sz="6" w:space="0" w:color="000000"/>
+              <w:bottom w:val="single" w:sz="6" w:space="0" w:color="000000"/>
+              <w:right w:val="single" w:sz="6" w:space="0" w:color="000000"/>
+            </w:tcBorders>
+            <w:shd w:val="clear" w:color="auto" w:fill="FFFFFF"/>
+          </w:tcPr>
+          <w:p>
+            <w:pPr>
+              <w:rPr>
+                <w:b/>
+                <w:bCs/>
+              </w:rPr>
+            </w:pPr>
+            <w:r>
+              <w:rPr>
+                <w:b/>
+                <w:bCs/>
+              </w:rPr>
+              <w:t>Project Team</w:t>
+            </w:r>
+          </w:p>
+        </w:tc>
+        <w:tc>
+          <w:tcPr>
+            <w:tcW w:w="851" w:type="dxa"/>
+            <w:tcBorders>
+              <w:top w:val="single" w:sz="6" w:space="0" w:color="000000"/>
+              <w:left w:val="single" w:sz="6" w:space="0" w:color="000000"/>
+              <w:bottom w:val="single" w:sz="6" w:space="0" w:color="000000"/>
+              <w:right w:val="single" w:sz="6" w:space="0" w:color="000000"/>
+            </w:tcBorders>
+            <w:shd w:val="clear" w:color="auto" w:fill="FFFFFF"/>
+          </w:tcPr>
+          <w:p>
+            <w:pPr>
+              <w:rPr>
+                <w:b/>
+                <w:bCs/>
+              </w:rPr>
+            </w:pPr>
+            <w:r>
+              <w:rPr>
+                <w:b/>
+                <w:bCs/>
+              </w:rPr>
+              <w:t>Open</w:t>
+            </w:r>
+          </w:p>
+        </w:tc>
+      </w:tr>
+      <w:tr>
+        <w:trPr>
+          <w:trHeight w:val="300"/>
+        </w:trPr>
+        <w:tc>
+          <w:tcPr>
+            <w:tcW w:w="812" w:type="dxa"/>
+            <w:tcBorders>
+              <w:top w:val="single" w:sz="6" w:space="0" w:color="000000"/>
+              <w:left w:val="single" w:sz="6" w:space="0" w:color="000000"/>
+              <w:bottom w:val="single" w:sz="6" w:space="0" w:color="000000"/>
+              <w:right w:val="single" w:sz="6" w:space="0" w:color="000000"/>
+            </w:tcBorders>
+            <w:shd w:val="clear" w:color="auto" w:fill="FFFFFF"/>
+          </w:tcPr>
+          <w:p>
+            <w:pPr>
+              <w:rPr>
+                <w:b/>
+                <w:bCs/>
+              </w:rPr>
+            </w:pPr>
+            <w:r>
+              <w:rPr>
+                <w:b/>
+                <w:bCs/>
+              </w:rPr>
+              <w:t>R-01</w:t>
+            </w:r>
+            <w:r>
+              <w:rPr>
+                <w:b/>
+                <w:bCs/>
+              </w:rPr>
+              <w:t>2</w:t>
+            </w:r>
+          </w:p>
+        </w:tc>
+        <w:tc>
+          <w:tcPr>
+            <w:tcW w:w="2299" w:type="dxa"/>
+            <w:tcBorders>
+              <w:top w:val="single" w:sz="6" w:space="0" w:color="000000"/>
+              <w:left w:val="single" w:sz="6" w:space="0" w:color="000000"/>
+              <w:bottom w:val="single" w:sz="6" w:space="0" w:color="000000"/>
+              <w:right w:val="single" w:sz="6" w:space="0" w:color="000000"/>
+            </w:tcBorders>
+            <w:shd w:val="clear" w:color="auto" w:fill="FFFFFF"/>
+          </w:tcPr>
+          <w:p>
+            <w:pPr>
+              <w:rPr>
+                <w:b/>
+                <w:bCs/>
+              </w:rPr>
+            </w:pPr>
+          </w:p>
+        </w:tc>
+        <w:tc>
+          <w:tcPr>
+            <w:tcW w:w="2126" w:type="dxa"/>
+            <w:tcBorders>
+              <w:top w:val="single" w:sz="6" w:space="0" w:color="000000"/>
+              <w:left w:val="single" w:sz="6" w:space="0" w:color="000000"/>
+              <w:bottom w:val="single" w:sz="6" w:space="0" w:color="000000"/>
+              <w:right w:val="single" w:sz="6" w:space="0" w:color="000000"/>
+            </w:tcBorders>
+            <w:shd w:val="clear" w:color="auto" w:fill="FFFFFF"/>
+          </w:tcPr>
+          <w:p>
+            <w:pPr>
+              <w:rPr>
+                <w:b/>
+                <w:bCs/>
+              </w:rPr>
+            </w:pPr>
+          </w:p>
+        </w:tc>
+        <w:tc>
+          <w:tcPr>
+            <w:tcW w:w="1134" w:type="dxa"/>
+            <w:tcBorders>
+              <w:top w:val="single" w:sz="6" w:space="0" w:color="000000"/>
+              <w:left w:val="single" w:sz="6" w:space="0" w:color="000000"/>
+              <w:bottom w:val="single" w:sz="6" w:space="0" w:color="000000"/>
+              <w:right w:val="single" w:sz="6" w:space="0" w:color="000000"/>
+            </w:tcBorders>
+            <w:shd w:val="clear" w:color="auto" w:fill="FFFFFF"/>
+          </w:tcPr>
+          <w:p>
+            <w:pPr>
+              <w:tabs>
+                <w:tab w:val="left" w:pos="1068"/>
+              </w:tabs>
+              <w:rPr>
+                <w:b/>
+                <w:bCs/>
+              </w:rPr>
+            </w:pPr>
+          </w:p>
+        </w:tc>
+        <w:tc>
+          <w:tcPr>
+            <w:tcW w:w="851" w:type="dxa"/>
+            <w:tcBorders>
+              <w:top w:val="single" w:sz="6" w:space="0" w:color="000000"/>
+              <w:left w:val="single" w:sz="6" w:space="0" w:color="000000"/>
+              <w:bottom w:val="single" w:sz="6" w:space="0" w:color="000000"/>
+              <w:right w:val="single" w:sz="6" w:space="0" w:color="000000"/>
+            </w:tcBorders>
+            <w:shd w:val="clear" w:color="auto" w:fill="FFFFFF"/>
+          </w:tcPr>
+          <w:p>
+            <w:pPr>
+              <w:rPr>
+                <w:b/>
+                <w:bCs/>
+              </w:rPr>
+            </w:pPr>
+          </w:p>
+        </w:tc>
+        <w:tc>
+          <w:tcPr>
+            <w:tcW w:w="850" w:type="dxa"/>
+            <w:tcBorders>
+              <w:top w:val="single" w:sz="6" w:space="0" w:color="000000"/>
+              <w:left w:val="single" w:sz="6" w:space="0" w:color="000000"/>
+              <w:bottom w:val="single" w:sz="6" w:space="0" w:color="000000"/>
+              <w:right w:val="single" w:sz="6" w:space="0" w:color="000000"/>
+            </w:tcBorders>
+            <w:shd w:val="clear" w:color="auto" w:fill="FFFFFF"/>
+          </w:tcPr>
+          <w:p>
+            <w:pPr>
+              <w:rPr>
+                <w:b/>
+                <w:bCs/>
+              </w:rPr>
+            </w:pPr>
+          </w:p>
+        </w:tc>
+        <w:tc>
+          <w:tcPr>
+            <w:tcW w:w="1559" w:type="dxa"/>
+            <w:tcBorders>
+              <w:top w:val="single" w:sz="6" w:space="0" w:color="000000"/>
+              <w:left w:val="single" w:sz="6" w:space="0" w:color="000000"/>
+              <w:bottom w:val="single" w:sz="6" w:space="0" w:color="000000"/>
+              <w:right w:val="single" w:sz="6" w:space="0" w:color="000000"/>
+            </w:tcBorders>
+            <w:shd w:val="clear" w:color="auto" w:fill="FFFFFF"/>
+          </w:tcPr>
+          <w:p>
+            <w:pPr>
+              <w:rPr>
+                <w:b/>
+                <w:bCs/>
+              </w:rPr>
+            </w:pPr>
+          </w:p>
+        </w:tc>
+        <w:tc>
+          <w:tcPr>
+            <w:tcW w:w="1843" w:type="dxa"/>
+            <w:tcBorders>
+              <w:top w:val="single" w:sz="6" w:space="0" w:color="000000"/>
+              <w:left w:val="single" w:sz="6" w:space="0" w:color="000000"/>
+              <w:bottom w:val="single" w:sz="6" w:space="0" w:color="000000"/>
+              <w:right w:val="single" w:sz="6" w:space="0" w:color="000000"/>
+            </w:tcBorders>
+            <w:shd w:val="clear" w:color="auto" w:fill="FFFFFF"/>
+          </w:tcPr>
+          <w:p>
+            <w:pPr>
+              <w:rPr>
+                <w:b/>
+                <w:bCs/>
+              </w:rPr>
+            </w:pPr>
+          </w:p>
+        </w:tc>
+        <w:tc>
+          <w:tcPr>
+            <w:tcW w:w="1559" w:type="dxa"/>
+            <w:tcBorders>
+              <w:top w:val="single" w:sz="6" w:space="0" w:color="000000"/>
+              <w:left w:val="single" w:sz="6" w:space="0" w:color="000000"/>
+              <w:bottom w:val="single" w:sz="6" w:space="0" w:color="000000"/>
+              <w:right w:val="single" w:sz="6" w:space="0" w:color="000000"/>
+            </w:tcBorders>
+            <w:shd w:val="clear" w:color="auto" w:fill="FFFFFF"/>
+          </w:tcPr>
+          <w:p>
+            <w:pPr>
+              <w:rPr>
+                <w:b/>
+                <w:bCs/>
+              </w:rPr>
+            </w:pPr>
+            <w:r>
+              <w:rPr>
+                <w:b/>
+                <w:bCs/>
+              </w:rPr>
+              <w:t>Project Team</w:t>
+            </w:r>
+          </w:p>
+        </w:tc>
+        <w:tc>
+          <w:tcPr>
+            <w:tcW w:w="851" w:type="dxa"/>
+            <w:tcBorders>
+              <w:top w:val="single" w:sz="6" w:space="0" w:color="000000"/>
+              <w:left w:val="single" w:sz="6" w:space="0" w:color="000000"/>
+              <w:bottom w:val="single" w:sz="6" w:space="0" w:color="000000"/>
+              <w:right w:val="single" w:sz="6" w:space="0" w:color="000000"/>
+            </w:tcBorders>
+            <w:shd w:val="clear" w:color="auto" w:fill="FFFFFF"/>
+          </w:tcPr>
+          <w:p>
+            <w:pPr>
+              <w:rPr>
+                <w:b/>
+                <w:bCs/>
+              </w:rPr>
+            </w:pPr>
+            <w:r>
+              <w:rPr>
+                <w:b/>
+                <w:bCs/>
+              </w:rPr>
+              <w:t>Open</w:t>
+            </w:r>
+          </w:p>
+        </w:tc>
+      </w:tr>
+      <w:tr>
+        <w:trPr>
+          <w:trHeight w:val="300"/>
+        </w:trPr>
+        <w:tc>
+          <w:tcPr>
+            <w:tcW w:w="812" w:type="dxa"/>
+            <w:tcBorders>
+              <w:top w:val="single" w:sz="6" w:space="0" w:color="000000"/>
+              <w:left w:val="single" w:sz="6" w:space="0" w:color="000000"/>
+              <w:bottom w:val="single" w:sz="6" w:space="0" w:color="000000"/>
+              <w:right w:val="single" w:sz="6" w:space="0" w:color="000000"/>
+            </w:tcBorders>
+            <w:shd w:val="clear" w:color="auto" w:fill="FFFFFF"/>
+          </w:tcPr>
+          <w:p>
+            <w:pPr>
+              <w:rPr>
+                <w:b/>
+                <w:bCs/>
+              </w:rPr>
+            </w:pPr>
+            <w:r>
+              <w:rPr>
+                <w:b/>
+                <w:bCs/>
+              </w:rPr>
+              <w:t>R-01</w:t>
+            </w:r>
+            <w:r>
+              <w:rPr>
+                <w:b/>
+                <w:bCs/>
+              </w:rPr>
+              <w:t>3</w:t>
+            </w:r>
+          </w:p>
+        </w:tc>
+        <w:tc>
+          <w:tcPr>
+            <w:tcW w:w="2299" w:type="dxa"/>
+            <w:tcBorders>
+              <w:top w:val="single" w:sz="6" w:space="0" w:color="000000"/>
+              <w:left w:val="single" w:sz="6" w:space="0" w:color="000000"/>
+              <w:bottom w:val="single" w:sz="6" w:space="0" w:color="000000"/>
+              <w:right w:val="single" w:sz="6" w:space="0" w:color="000000"/>
+            </w:tcBorders>
+            <w:shd w:val="clear" w:color="auto" w:fill="FFFFFF"/>
+          </w:tcPr>
+          <w:p>
+            <w:pPr>
+              <w:jc w:val="center"/>
+              <w:rPr>
+                <w:b/>
+                <w:bCs/>
+              </w:rPr>
+            </w:pPr>
+            <w:r>
+              <w:rPr>
+                <w:b/>
+                <w:bCs/>
+              </w:rPr>
+              <w:t xml:space="preserve">A privileged </w:t>
+            </w:r>
+            <w:proofErr w:type="spellStart"/>
+            <w:r>
+              <w:rPr>
+                <w:b/>
+                <w:bCs/>
+              </w:rPr>
+              <w:t>Supabase</w:t>
+            </w:r>
+            <w:proofErr w:type="spellEnd"/>
+            <w:r>
+              <w:rPr>
+                <w:b/>
+                <w:bCs/>
+              </w:rPr>
+              <w:t xml:space="preserve"> secret could be exposed.</w:t>
+            </w:r>
+          </w:p>
+        </w:tc>
+        <w:tc>
+          <w:tcPr>
+            <w:tcW w:w="2126" w:type="dxa"/>
+            <w:tcBorders>
+              <w:top w:val="single" w:sz="6" w:space="0" w:color="000000"/>
+              <w:left w:val="single" w:sz="6" w:space="0" w:color="000000"/>
+              <w:bottom w:val="single" w:sz="6" w:space="0" w:color="000000"/>
+              <w:right w:val="single" w:sz="6" w:space="0" w:color="000000"/>
+            </w:tcBorders>
+            <w:shd w:val="clear" w:color="auto" w:fill="FFFFFF"/>
+          </w:tcPr>
+          <w:p>
+            <w:pPr>
+              <w:rPr>
+                <w:b/>
+                <w:bCs/>
+              </w:rPr>
+            </w:pPr>
+            <w:r>
+              <w:rPr>
+                <w:b/>
+                <w:bCs/>
+              </w:rPr>
+              <w:t>Incorrect environment configuration between development, preview and production.</w:t>
+            </w:r>
+          </w:p>
+        </w:tc>
+        <w:tc>
+          <w:tcPr>
+            <w:tcW w:w="1134" w:type="dxa"/>
+            <w:tcBorders>
+              <w:top w:val="single" w:sz="6" w:space="0" w:color="000000"/>
+              <w:left w:val="single" w:sz="6" w:space="0" w:color="000000"/>
+              <w:bottom w:val="single" w:sz="6" w:space="0" w:color="000000"/>
+              <w:right w:val="single" w:sz="6" w:space="0" w:color="000000"/>
+            </w:tcBorders>
+            <w:shd w:val="clear" w:color="auto" w:fill="FFFFFF"/>
+          </w:tcPr>
+          <w:p>
+            <w:pPr>
+              <w:tabs>
+                <w:tab w:val="left" w:pos="1068"/>
+              </w:tabs>
+              <w:rPr>
+                <w:b/>
+                <w:bCs/>
+              </w:rPr>
+            </w:pPr>
+            <w:r>
+              <w:rPr>
+                <w:b/>
+                <w:bCs/>
+              </w:rPr>
+              <w:t>Medium</w:t>
+            </w:r>
+          </w:p>
+        </w:tc>
+        <w:tc>
+          <w:tcPr>
+            <w:tcW w:w="851" w:type="dxa"/>
+            <w:tcBorders>
+              <w:top w:val="single" w:sz="6" w:space="0" w:color="000000"/>
+              <w:left w:val="single" w:sz="6" w:space="0" w:color="000000"/>
+              <w:bottom w:val="single" w:sz="6" w:space="0" w:color="000000"/>
+              <w:right w:val="single" w:sz="6" w:space="0" w:color="000000"/>
+            </w:tcBorders>
+            <w:shd w:val="clear" w:color="auto" w:fill="FFFFFF"/>
+          </w:tcPr>
+          <w:p>
+            <w:pPr>
+              <w:rPr>
+                <w:b/>
+                <w:bCs/>
+              </w:rPr>
+            </w:pPr>
+            <w:r>
+              <w:rPr>
+                <w:b/>
+                <w:bCs/>
+              </w:rPr>
+              <w:t>High</w:t>
+            </w:r>
+          </w:p>
+        </w:tc>
+        <w:tc>
+          <w:tcPr>
+            <w:tcW w:w="850" w:type="dxa"/>
+            <w:tcBorders>
+              <w:top w:val="single" w:sz="6" w:space="0" w:color="000000"/>
+              <w:left w:val="single" w:sz="6" w:space="0" w:color="000000"/>
+              <w:bottom w:val="single" w:sz="6" w:space="0" w:color="000000"/>
+              <w:right w:val="single" w:sz="6" w:space="0" w:color="000000"/>
+            </w:tcBorders>
+            <w:shd w:val="clear" w:color="auto" w:fill="FFFFFF"/>
+          </w:tcPr>
+          <w:p>
+            <w:pPr>
+              <w:rPr>
+                <w:b/>
+                <w:bCs/>
+              </w:rPr>
+            </w:pPr>
+            <w:r>
+              <w:rPr>
+                <w:b/>
+                <w:bCs/>
+              </w:rPr>
+              <w:t>High</w:t>
+            </w:r>
+          </w:p>
+        </w:tc>
+        <w:tc>
+          <w:tcPr>
+            <w:tcW w:w="1559" w:type="dxa"/>
+            <w:tcBorders>
+              <w:top w:val="single" w:sz="6" w:space="0" w:color="000000"/>
+              <w:left w:val="single" w:sz="6" w:space="0" w:color="000000"/>
+              <w:bottom w:val="single" w:sz="6" w:space="0" w:color="000000"/>
+              <w:right w:val="single" w:sz="6" w:space="0" w:color="000000"/>
+            </w:tcBorders>
+            <w:shd w:val="clear" w:color="auto" w:fill="FFFFFF"/>
+          </w:tcPr>
+          <w:p>
+            <w:pPr>
+              <w:rPr>
+                <w:b/>
+                <w:bCs/>
+              </w:rPr>
+            </w:pPr>
+            <w:r>
+              <w:rPr>
+                <w:b/>
+                <w:bCs/>
+              </w:rPr>
+              <w:t>Keep environment settings separate and verify them during deployment testing.</w:t>
+            </w:r>
+          </w:p>
+        </w:tc>
+        <w:tc>
+          <w:tcPr>
+            <w:tcW w:w="1843" w:type="dxa"/>
+            <w:tcBorders>
+              <w:top w:val="single" w:sz="6" w:space="0" w:color="000000"/>
+              <w:left w:val="single" w:sz="6" w:space="0" w:color="000000"/>
+              <w:bottom w:val="single" w:sz="6" w:space="0" w:color="000000"/>
+              <w:right w:val="single" w:sz="6" w:space="0" w:color="000000"/>
+            </w:tcBorders>
+            <w:shd w:val="clear" w:color="auto" w:fill="FFFFFF"/>
+          </w:tcPr>
+          <w:p>
+            <w:pPr>
+              <w:rPr>
+                <w:b/>
+                <w:bCs/>
+              </w:rPr>
+            </w:pPr>
+            <w:r>
+              <w:rPr>
+                <w:b/>
+                <w:bCs/>
+              </w:rPr>
+              <w:t>Correct the environment configuration and redeploy the affected version.</w:t>
+            </w:r>
+          </w:p>
+        </w:tc>
+        <w:tc>
+          <w:tcPr>
+            <w:tcW w:w="1559" w:type="dxa"/>
+            <w:tcBorders>
+              <w:top w:val="single" w:sz="6" w:space="0" w:color="000000"/>
+              <w:left w:val="single" w:sz="6" w:space="0" w:color="000000"/>
+              <w:bottom w:val="single" w:sz="6" w:space="0" w:color="000000"/>
+              <w:right w:val="single" w:sz="6" w:space="0" w:color="000000"/>
+            </w:tcBorders>
+            <w:shd w:val="clear" w:color="auto" w:fill="FFFFFF"/>
+          </w:tcPr>
+          <w:p>
+            <w:pPr>
+              <w:rPr>
+                <w:b/>
+                <w:bCs/>
+              </w:rPr>
+            </w:pPr>
+            <w:r>
+              <w:rPr>
+                <w:b/>
+                <w:bCs/>
+              </w:rPr>
+              <w:t>Project Team</w:t>
+            </w:r>
+          </w:p>
+        </w:tc>
+        <w:tc>
+          <w:tcPr>
+            <w:tcW w:w="851" w:type="dxa"/>
+            <w:tcBorders>
+              <w:top w:val="single" w:sz="6" w:space="0" w:color="000000"/>
+              <w:left w:val="single" w:sz="6" w:space="0" w:color="000000"/>
+              <w:bottom w:val="single" w:sz="6" w:space="0" w:color="000000"/>
+              <w:right w:val="single" w:sz="6" w:space="0" w:color="000000"/>
+            </w:tcBorders>
+            <w:shd w:val="clear" w:color="auto" w:fill="FFFFFF"/>
+          </w:tcPr>
+          <w:p>
+            <w:pPr>
+              <w:rPr>
+                <w:b/>
+                <w:bCs/>
+              </w:rPr>
+            </w:pPr>
+            <w:r>
+              <w:rPr>
+                <w:b/>
+                <w:bCs/>
+              </w:rPr>
+              <w:t>Open</w:t>
+            </w:r>
+          </w:p>
+        </w:tc>
+      </w:tr>
+      <w:tr>
+        <w:trPr>
+          <w:trHeight w:val="300"/>
+        </w:trPr>
+        <w:tc>
+          <w:tcPr>
+            <w:tcW w:w="812" w:type="dxa"/>
+            <w:tcBorders>
+              <w:top w:val="single" w:sz="6" w:space="0" w:color="000000"/>
+              <w:left w:val="single" w:sz="6" w:space="0" w:color="000000"/>
+              <w:bottom w:val="single" w:sz="6" w:space="0" w:color="000000"/>
+              <w:right w:val="single" w:sz="6" w:space="0" w:color="000000"/>
+            </w:tcBorders>
+            <w:shd w:val="clear" w:color="auto" w:fill="FFFFFF"/>
+          </w:tcPr>
+          <w:p>
+            <w:pPr>
+              <w:rPr>
+                <w:b/>
+                <w:bCs/>
+              </w:rPr>
+            </w:pPr>
+            <w:r>
+              <w:rPr>
+                <w:b/>
+                <w:bCs/>
+              </w:rPr>
+              <w:t>R-01</w:t>
+            </w:r>
+            <w:r>
+              <w:rPr>
+                <w:b/>
+                <w:bCs/>
+              </w:rPr>
+              <w:t>4</w:t>
+            </w:r>
+          </w:p>
+        </w:tc>
+        <w:tc>
+          <w:tcPr>
+            <w:tcW w:w="2299" w:type="dxa"/>
+            <w:tcBorders>
+              <w:top w:val="single" w:sz="6" w:space="0" w:color="000000"/>
+              <w:left w:val="single" w:sz="6" w:space="0" w:color="000000"/>
+              <w:bottom w:val="single" w:sz="6" w:space="0" w:color="000000"/>
+              <w:right w:val="single" w:sz="6" w:space="0" w:color="000000"/>
+            </w:tcBorders>
+            <w:shd w:val="clear" w:color="auto" w:fill="FFFFFF"/>
+          </w:tcPr>
+          <w:p>
+            <w:pPr>
+              <w:rPr>
+                <w:b/>
+                <w:bCs/>
+              </w:rPr>
+            </w:pPr>
+            <w:r>
+              <w:rPr>
+                <w:b/>
+                <w:bCs/>
+              </w:rPr>
+              <w:t xml:space="preserve">A privileged </w:t>
+            </w:r>
+            <w:proofErr w:type="spellStart"/>
+            <w:r>
+              <w:rPr>
+                <w:b/>
+                <w:bCs/>
+              </w:rPr>
+              <w:t>Supabase</w:t>
+            </w:r>
+            <w:proofErr w:type="spellEnd"/>
+            <w:r>
+              <w:rPr>
+                <w:b/>
+                <w:bCs/>
+              </w:rPr>
+              <w:t xml:space="preserve"> secret could be exposed if it is placed in frontend code or committed to Git.</w:t>
+            </w:r>
+          </w:p>
+        </w:tc>
+        <w:tc>
+          <w:tcPr>
+            <w:tcW w:w="2126" w:type="dxa"/>
+            <w:tcBorders>
+              <w:top w:val="single" w:sz="6" w:space="0" w:color="000000"/>
+              <w:left w:val="single" w:sz="6" w:space="0" w:color="000000"/>
+              <w:bottom w:val="single" w:sz="6" w:space="0" w:color="000000"/>
+              <w:right w:val="single" w:sz="6" w:space="0" w:color="000000"/>
+            </w:tcBorders>
+            <w:shd w:val="clear" w:color="auto" w:fill="FFFFFF"/>
+          </w:tcPr>
+          <w:p>
+            <w:pPr>
+              <w:tabs>
+                <w:tab w:val="center" w:pos="1055"/>
+              </w:tabs>
+              <w:rPr>
+                <w:b/>
+                <w:bCs/>
+              </w:rPr>
+            </w:pPr>
+            <w:r>
+              <w:rPr>
+                <w:b/>
+                <w:bCs/>
+              </w:rPr>
+              <w:t>A secret key is accidentally placed in frontend code or committed to Git.</w:t>
+            </w:r>
+          </w:p>
+        </w:tc>
+        <w:tc>
+          <w:tcPr>
+            <w:tcW w:w="1134" w:type="dxa"/>
+            <w:tcBorders>
+              <w:top w:val="single" w:sz="6" w:space="0" w:color="000000"/>
+              <w:left w:val="single" w:sz="6" w:space="0" w:color="000000"/>
+              <w:bottom w:val="single" w:sz="6" w:space="0" w:color="000000"/>
+              <w:right w:val="single" w:sz="6" w:space="0" w:color="000000"/>
+            </w:tcBorders>
+            <w:shd w:val="clear" w:color="auto" w:fill="FFFFFF"/>
+          </w:tcPr>
+          <w:p>
+            <w:pPr>
+              <w:tabs>
+                <w:tab w:val="left" w:pos="1068"/>
+              </w:tabs>
+              <w:rPr>
+                <w:b/>
+                <w:bCs/>
+              </w:rPr>
+            </w:pPr>
+            <w:r>
+              <w:rPr>
+                <w:b/>
+                <w:bCs/>
+              </w:rPr>
+              <w:t>Low</w:t>
+            </w:r>
+          </w:p>
+        </w:tc>
+        <w:tc>
+          <w:tcPr>
+            <w:tcW w:w="851" w:type="dxa"/>
+            <w:tcBorders>
+              <w:top w:val="single" w:sz="6" w:space="0" w:color="000000"/>
+              <w:left w:val="single" w:sz="6" w:space="0" w:color="000000"/>
+              <w:bottom w:val="single" w:sz="6" w:space="0" w:color="000000"/>
+              <w:right w:val="single" w:sz="6" w:space="0" w:color="000000"/>
+            </w:tcBorders>
+            <w:shd w:val="clear" w:color="auto" w:fill="FFFFFF"/>
+          </w:tcPr>
+          <w:p>
+            <w:pPr>
+              <w:rPr>
+                <w:b/>
+                <w:bCs/>
+              </w:rPr>
+            </w:pPr>
+            <w:r>
+              <w:rPr>
+                <w:b/>
+                <w:bCs/>
+              </w:rPr>
+              <w:t>High</w:t>
+            </w:r>
+          </w:p>
+        </w:tc>
+        <w:tc>
+          <w:tcPr>
+            <w:tcW w:w="850" w:type="dxa"/>
+            <w:tcBorders>
+              <w:top w:val="single" w:sz="6" w:space="0" w:color="000000"/>
+              <w:left w:val="single" w:sz="6" w:space="0" w:color="000000"/>
+              <w:bottom w:val="single" w:sz="6" w:space="0" w:color="000000"/>
+              <w:right w:val="single" w:sz="6" w:space="0" w:color="000000"/>
+            </w:tcBorders>
+            <w:shd w:val="clear" w:color="auto" w:fill="FFFFFF"/>
+          </w:tcPr>
+          <w:p>
+            <w:pPr>
+              <w:rPr>
+                <w:b/>
+                <w:bCs/>
+              </w:rPr>
+            </w:pPr>
+            <w:r>
+              <w:rPr>
+                <w:b/>
+                <w:bCs/>
+              </w:rPr>
+              <w:t>Medium</w:t>
+            </w:r>
+          </w:p>
+        </w:tc>
+        <w:tc>
+          <w:tcPr>
+            <w:tcW w:w="1559" w:type="dxa"/>
+            <w:tcBorders>
+              <w:top w:val="single" w:sz="6" w:space="0" w:color="000000"/>
+              <w:left w:val="single" w:sz="6" w:space="0" w:color="000000"/>
+              <w:bottom w:val="single" w:sz="6" w:space="0" w:color="000000"/>
+              <w:right w:val="single" w:sz="6" w:space="0" w:color="000000"/>
+            </w:tcBorders>
+            <w:shd w:val="clear" w:color="auto" w:fill="FFFFFF"/>
+          </w:tcPr>
+          <w:p>
+            <w:pPr>
+              <w:rPr>
+                <w:b/>
+                <w:bCs/>
+              </w:rPr>
+            </w:pPr>
+            <w:r>
+              <w:rPr>
+                <w:b/>
+                <w:bCs/>
+              </w:rPr>
+              <w:t>Only use the publishable key in frontend code and keep privileged secrets out of source control.</w:t>
+            </w:r>
+          </w:p>
+        </w:tc>
+        <w:tc>
+          <w:tcPr>
+            <w:tcW w:w="1843" w:type="dxa"/>
+            <w:tcBorders>
+              <w:top w:val="single" w:sz="6" w:space="0" w:color="000000"/>
+              <w:left w:val="single" w:sz="6" w:space="0" w:color="000000"/>
+              <w:bottom w:val="single" w:sz="6" w:space="0" w:color="000000"/>
+              <w:right w:val="single" w:sz="6" w:space="0" w:color="000000"/>
+            </w:tcBorders>
+            <w:shd w:val="clear" w:color="auto" w:fill="FFFFFF"/>
+          </w:tcPr>
+          <w:p>
+            <w:pPr>
+              <w:rPr>
+                <w:b/>
+                <w:bCs/>
+              </w:rPr>
+            </w:pPr>
+            <w:r>
+              <w:rPr>
+                <w:b/>
+                <w:bCs/>
+              </w:rPr>
+              <w:t>Revoke and replace the exposed key immediately and review access for suspicious activity.</w:t>
+            </w:r>
+          </w:p>
+        </w:tc>
+        <w:tc>
+          <w:tcPr>
+            <w:tcW w:w="1559" w:type="dxa"/>
+            <w:tcBorders>
+              <w:top w:val="single" w:sz="6" w:space="0" w:color="000000"/>
+              <w:left w:val="single" w:sz="6" w:space="0" w:color="000000"/>
+              <w:bottom w:val="single" w:sz="6" w:space="0" w:color="000000"/>
+              <w:right w:val="single" w:sz="6" w:space="0" w:color="000000"/>
+            </w:tcBorders>
+            <w:shd w:val="clear" w:color="auto" w:fill="FFFFFF"/>
+          </w:tcPr>
+          <w:p>
+            <w:pPr>
+              <w:rPr>
+                <w:b/>
+                <w:bCs/>
+              </w:rPr>
+            </w:pPr>
+            <w:r>
+              <w:rPr>
+                <w:b/>
+                <w:bCs/>
+              </w:rPr>
+              <w:t>Project Team</w:t>
+            </w:r>
+          </w:p>
+        </w:tc>
+        <w:tc>
+          <w:tcPr>
+            <w:tcW w:w="851" w:type="dxa"/>
+            <w:tcBorders>
+              <w:top w:val="single" w:sz="6" w:space="0" w:color="000000"/>
+              <w:left w:val="single" w:sz="6" w:space="0" w:color="000000"/>
+              <w:bottom w:val="single" w:sz="6" w:space="0" w:color="000000"/>
+              <w:right w:val="single" w:sz="6" w:space="0" w:color="000000"/>
+            </w:tcBorders>
+            <w:shd w:val="clear" w:color="auto" w:fill="FFFFFF"/>
+          </w:tcPr>
+          <w:p>
+            <w:pPr>
+              <w:rPr>
+                <w:b/>
+                <w:bCs/>
+              </w:rPr>
+            </w:pPr>
+            <w:r>
+              <w:rPr>
+                <w:b/>
+                <w:bCs/>
+              </w:rPr>
+              <w:t>Open</w:t>
+            </w:r>
+          </w:p>
+        </w:tc>
+      </w:tr>
+      <w:tr>
+        <w:trPr>
+          <w:trHeight w:val="300"/>
+        </w:trPr>
+        <w:tc>
+          <w:tcPr>
+            <w:tcW w:w="812" w:type="dxa"/>
+            <w:tcBorders>
+              <w:top w:val="single" w:sz="6" w:space="0" w:color="000000"/>
+              <w:left w:val="single" w:sz="6" w:space="0" w:color="000000"/>
+              <w:bottom w:val="single" w:sz="6" w:space="0" w:color="000000"/>
+              <w:right w:val="single" w:sz="6" w:space="0" w:color="000000"/>
+            </w:tcBorders>
+            <w:shd w:val="clear" w:color="auto" w:fill="FFFFFF"/>
+          </w:tcPr>
+          <w:p>
+            <w:pPr>
+              <w:rPr>
+                <w:b/>
+                <w:bCs/>
+              </w:rPr>
+            </w:pPr>
+            <w:r>
+              <w:rPr>
+                <w:b/>
+                <w:bCs/>
+              </w:rPr>
+              <w:t>R-01</w:t>
+            </w:r>
+            <w:r>
+              <w:rPr>
+                <w:b/>
+                <w:bCs/>
+              </w:rPr>
+              <w:t>5</w:t>
+            </w:r>
+          </w:p>
+        </w:tc>
+        <w:tc>
+          <w:tcPr>
+            <w:tcW w:w="2299" w:type="dxa"/>
+            <w:tcBorders>
+              <w:top w:val="single" w:sz="6" w:space="0" w:color="000000"/>
+              <w:left w:val="single" w:sz="6" w:space="0" w:color="000000"/>
+              <w:bottom w:val="single" w:sz="6" w:space="0" w:color="000000"/>
+              <w:right w:val="single" w:sz="6" w:space="0" w:color="000000"/>
+            </w:tcBorders>
+            <w:shd w:val="clear" w:color="auto" w:fill="FFFFFF"/>
+          </w:tcPr>
+          <w:p>
+            <w:pPr>
+              <w:rPr>
+                <w:b/>
+                <w:bCs/>
+              </w:rPr>
+            </w:pPr>
+            <w:proofErr w:type="spellStart"/>
+            <w:r>
+              <w:rPr>
+                <w:b/>
+                <w:bCs/>
+              </w:rPr>
+              <w:t>CivicConnect</w:t>
+            </w:r>
+            <w:proofErr w:type="spellEnd"/>
+            <w:r>
+              <w:rPr>
+                <w:b/>
+                <w:bCs/>
+              </w:rPr>
+              <w:t xml:space="preserve"> could be affected by </w:t>
+            </w:r>
+            <w:proofErr w:type="spellStart"/>
+            <w:r>
+              <w:rPr>
+                <w:b/>
+                <w:bCs/>
+              </w:rPr>
+              <w:t>Vercel</w:t>
+            </w:r>
+            <w:proofErr w:type="spellEnd"/>
+            <w:r>
+              <w:rPr>
+                <w:b/>
+                <w:bCs/>
+              </w:rPr>
+              <w:t xml:space="preserve"> or </w:t>
+            </w:r>
+            <w:proofErr w:type="spellStart"/>
+            <w:r>
+              <w:rPr>
+                <w:b/>
+                <w:bCs/>
+              </w:rPr>
+              <w:t>Supabase</w:t>
+            </w:r>
+            <w:proofErr w:type="spellEnd"/>
+            <w:r>
+              <w:rPr>
+                <w:b/>
+                <w:bCs/>
+              </w:rPr>
+              <w:t xml:space="preserve"> availability, service limits or pricing changes.</w:t>
+            </w:r>
+          </w:p>
+        </w:tc>
+        <w:tc>
+          <w:tcPr>
+            <w:tcW w:w="2126" w:type="dxa"/>
+            <w:tcBorders>
+              <w:top w:val="single" w:sz="6" w:space="0" w:color="000000"/>
+              <w:left w:val="single" w:sz="6" w:space="0" w:color="000000"/>
+              <w:bottom w:val="single" w:sz="6" w:space="0" w:color="000000"/>
+              <w:right w:val="single" w:sz="6" w:space="0" w:color="000000"/>
+            </w:tcBorders>
+            <w:shd w:val="clear" w:color="auto" w:fill="FFFFFF"/>
+          </w:tcPr>
+          <w:p>
+            <w:pPr>
+              <w:rPr>
+                <w:b/>
+                <w:bCs/>
+              </w:rPr>
+            </w:pPr>
+            <w:r>
+              <w:rPr>
+                <w:b/>
+                <w:bCs/>
+              </w:rPr>
+              <w:t>The proposed deployment depends on external hosted services.</w:t>
+            </w:r>
+          </w:p>
+        </w:tc>
+        <w:tc>
+          <w:tcPr>
+            <w:tcW w:w="1134" w:type="dxa"/>
+            <w:tcBorders>
+              <w:top w:val="single" w:sz="6" w:space="0" w:color="000000"/>
+              <w:left w:val="single" w:sz="6" w:space="0" w:color="000000"/>
+              <w:bottom w:val="single" w:sz="6" w:space="0" w:color="000000"/>
+              <w:right w:val="single" w:sz="6" w:space="0" w:color="000000"/>
+            </w:tcBorders>
+            <w:shd w:val="clear" w:color="auto" w:fill="FFFFFF"/>
+          </w:tcPr>
+          <w:p>
+            <w:pPr>
+              <w:tabs>
+                <w:tab w:val="left" w:pos="1068"/>
+              </w:tabs>
+              <w:rPr>
+                <w:b/>
+                <w:bCs/>
+              </w:rPr>
+            </w:pPr>
+            <w:r>
+              <w:rPr>
+                <w:b/>
+                <w:bCs/>
+              </w:rPr>
+              <w:t>Low</w:t>
+            </w:r>
+          </w:p>
+        </w:tc>
+        <w:tc>
+          <w:tcPr>
+            <w:tcW w:w="851" w:type="dxa"/>
+            <w:tcBorders>
+              <w:top w:val="single" w:sz="6" w:space="0" w:color="000000"/>
+              <w:left w:val="single" w:sz="6" w:space="0" w:color="000000"/>
+              <w:bottom w:val="single" w:sz="6" w:space="0" w:color="000000"/>
+              <w:right w:val="single" w:sz="6" w:space="0" w:color="000000"/>
+            </w:tcBorders>
+            <w:shd w:val="clear" w:color="auto" w:fill="FFFFFF"/>
+          </w:tcPr>
+          <w:p>
+            <w:pPr>
+              <w:rPr>
+                <w:b/>
+                <w:bCs/>
+              </w:rPr>
+            </w:pPr>
+            <w:r>
+              <w:rPr>
+                <w:b/>
+                <w:bCs/>
+              </w:rPr>
+              <w:t>Medium</w:t>
+            </w:r>
+          </w:p>
+        </w:tc>
+        <w:tc>
+          <w:tcPr>
+            <w:tcW w:w="850" w:type="dxa"/>
+            <w:tcBorders>
+              <w:top w:val="single" w:sz="6" w:space="0" w:color="000000"/>
+              <w:left w:val="single" w:sz="6" w:space="0" w:color="000000"/>
+              <w:bottom w:val="single" w:sz="6" w:space="0" w:color="000000"/>
+              <w:right w:val="single" w:sz="6" w:space="0" w:color="000000"/>
+            </w:tcBorders>
+            <w:shd w:val="clear" w:color="auto" w:fill="FFFFFF"/>
+          </w:tcPr>
+          <w:p>
+            <w:pPr>
+              <w:rPr>
+                <w:b/>
+                <w:bCs/>
+              </w:rPr>
+            </w:pPr>
+            <w:r>
+              <w:rPr>
+                <w:b/>
+                <w:bCs/>
+              </w:rPr>
+              <w:t>Medium</w:t>
+            </w:r>
+          </w:p>
+        </w:tc>
+        <w:tc>
+          <w:tcPr>
+            <w:tcW w:w="1559" w:type="dxa"/>
+            <w:tcBorders>
+              <w:top w:val="single" w:sz="6" w:space="0" w:color="000000"/>
+              <w:left w:val="single" w:sz="6" w:space="0" w:color="000000"/>
+              <w:bottom w:val="single" w:sz="6" w:space="0" w:color="000000"/>
+              <w:right w:val="single" w:sz="6" w:space="0" w:color="000000"/>
+            </w:tcBorders>
+            <w:shd w:val="clear" w:color="auto" w:fill="FFFFFF"/>
+          </w:tcPr>
+          <w:p>
+            <w:pPr>
+              <w:rPr>
+                <w:b/>
+                <w:bCs/>
+              </w:rPr>
+            </w:pPr>
+            <w:r>
+              <w:rPr>
+                <w:b/>
+                <w:bCs/>
+              </w:rPr>
+              <w:t xml:space="preserve">Review service limits and production requirements before launch and monitor </w:t>
+            </w:r>
+            <w:r>
+              <w:rPr>
+                <w:b/>
+                <w:bCs/>
+              </w:rPr>
+              <w:lastRenderedPageBreak/>
+              <w:t>relevant platform changes</w:t>
+            </w:r>
+          </w:p>
+        </w:tc>
+        <w:tc>
+          <w:tcPr>
+            <w:tcW w:w="1843" w:type="dxa"/>
+            <w:tcBorders>
+              <w:top w:val="single" w:sz="6" w:space="0" w:color="000000"/>
+              <w:left w:val="single" w:sz="6" w:space="0" w:color="000000"/>
+              <w:bottom w:val="single" w:sz="6" w:space="0" w:color="000000"/>
+              <w:right w:val="single" w:sz="6" w:space="0" w:color="000000"/>
+            </w:tcBorders>
+            <w:shd w:val="clear" w:color="auto" w:fill="FFFFFF"/>
+          </w:tcPr>
+          <w:p>
+            <w:pPr>
+              <w:rPr>
+                <w:b/>
+                <w:bCs/>
+              </w:rPr>
+            </w:pPr>
+            <w:r>
+              <w:rPr>
+                <w:b/>
+                <w:bCs/>
+              </w:rPr>
+              <w:lastRenderedPageBreak/>
+              <w:t xml:space="preserve">Reconsider the hosting option or service plan if the selected platforms no </w:t>
+            </w:r>
+            <w:r>
+              <w:rPr>
+                <w:b/>
+                <w:bCs/>
+              </w:rPr>
+              <w:lastRenderedPageBreak/>
+              <w:t>longer meet project needs.</w:t>
+            </w:r>
+          </w:p>
+        </w:tc>
+        <w:tc>
+          <w:tcPr>
+            <w:tcW w:w="1559" w:type="dxa"/>
+            <w:tcBorders>
+              <w:top w:val="single" w:sz="6" w:space="0" w:color="000000"/>
+              <w:left w:val="single" w:sz="6" w:space="0" w:color="000000"/>
+              <w:bottom w:val="single" w:sz="6" w:space="0" w:color="000000"/>
+              <w:right w:val="single" w:sz="6" w:space="0" w:color="000000"/>
+            </w:tcBorders>
+            <w:shd w:val="clear" w:color="auto" w:fill="FFFFFF"/>
+          </w:tcPr>
+          <w:p>
+            <w:pPr>
+              <w:rPr>
+                <w:b/>
+                <w:bCs/>
+              </w:rPr>
+            </w:pPr>
+            <w:r>
+              <w:rPr>
+                <w:b/>
+                <w:bCs/>
+              </w:rPr>
+              <w:lastRenderedPageBreak/>
+              <w:t>Project Team</w:t>
+            </w:r>
+          </w:p>
+        </w:tc>
+        <w:tc>
+          <w:tcPr>
+            <w:tcW w:w="851" w:type="dxa"/>
+            <w:tcBorders>
+              <w:top w:val="single" w:sz="6" w:space="0" w:color="000000"/>
+              <w:left w:val="single" w:sz="6" w:space="0" w:color="000000"/>
+              <w:bottom w:val="single" w:sz="6" w:space="0" w:color="000000"/>
+              <w:right w:val="single" w:sz="6" w:space="0" w:color="000000"/>
+            </w:tcBorders>
+            <w:shd w:val="clear" w:color="auto" w:fill="FFFFFF"/>
+          </w:tcPr>
+          <w:p>
+            <w:pPr>
+              <w:rPr>
+                <w:b/>
+                <w:bCs/>
+              </w:rPr>
+            </w:pPr>
+            <w:r>
+              <w:rPr>
+                <w:b/>
+                <w:bCs/>
+              </w:rPr>
+              <w:t>Open</w:t>
+            </w:r>
+          </w:p>
+        </w:tc>
+      </w:tr>
+      <w:tr>
+        <w:trPr>
+          <w:trHeight w:val="300"/>
+        </w:trPr>
+        <w:tc>
+          <w:tcPr>
+            <w:tcW w:w="812" w:type="dxa"/>
+            <w:tcBorders>
+              <w:top w:val="single" w:sz="6" w:space="0" w:color="000000"/>
+              <w:left w:val="single" w:sz="6" w:space="0" w:color="000000"/>
+              <w:bottom w:val="single" w:sz="6" w:space="0" w:color="000000"/>
+              <w:right w:val="single" w:sz="6" w:space="0" w:color="000000"/>
+            </w:tcBorders>
+            <w:shd w:val="clear" w:color="auto" w:fill="FFFFFF"/>
+          </w:tcPr>
+          <w:p>
+            <w:pPr>
+              <w:rPr>
+                <w:b/>
+                <w:bCs/>
+              </w:rPr>
+            </w:pPr>
+            <w:r>
+              <w:rPr>
+                <w:b/>
+                <w:bCs/>
+              </w:rPr>
+              <w:t>R-01</w:t>
+            </w:r>
+            <w:r>
+              <w:rPr>
+                <w:b/>
+                <w:bCs/>
+              </w:rPr>
+              <w:t>6</w:t>
+            </w:r>
+          </w:p>
+        </w:tc>
+        <w:tc>
+          <w:tcPr>
+            <w:tcW w:w="2299" w:type="dxa"/>
+            <w:tcBorders>
+              <w:top w:val="single" w:sz="6" w:space="0" w:color="000000"/>
+              <w:left w:val="single" w:sz="6" w:space="0" w:color="000000"/>
+              <w:bottom w:val="single" w:sz="6" w:space="0" w:color="000000"/>
+              <w:right w:val="single" w:sz="6" w:space="0" w:color="000000"/>
+            </w:tcBorders>
+            <w:shd w:val="clear" w:color="auto" w:fill="FFFFFF"/>
+          </w:tcPr>
+          <w:p>
+            <w:pPr>
+              <w:rPr>
+                <w:b/>
+                <w:bCs/>
+              </w:rPr>
+            </w:pPr>
+            <w:r>
+              <w:rPr>
+                <w:b/>
+                <w:bCs/>
+              </w:rPr>
+              <w:t>A deployment may build successfully but still have problems with authentication, routing or RLS outside local development.</w:t>
+            </w:r>
+          </w:p>
+        </w:tc>
+        <w:tc>
+          <w:tcPr>
+            <w:tcW w:w="2126" w:type="dxa"/>
+            <w:tcBorders>
+              <w:top w:val="single" w:sz="6" w:space="0" w:color="000000"/>
+              <w:left w:val="single" w:sz="6" w:space="0" w:color="000000"/>
+              <w:bottom w:val="single" w:sz="6" w:space="0" w:color="000000"/>
+              <w:right w:val="single" w:sz="6" w:space="0" w:color="000000"/>
+            </w:tcBorders>
+            <w:shd w:val="clear" w:color="auto" w:fill="FFFFFF"/>
+          </w:tcPr>
+          <w:p>
+            <w:pPr>
+              <w:rPr>
+                <w:b/>
+                <w:bCs/>
+              </w:rPr>
+            </w:pPr>
+            <w:r>
+              <w:rPr>
+                <w:b/>
+                <w:bCs/>
+              </w:rPr>
+              <w:t>Some issues may only appear in the deployed environment rather than during local development.</w:t>
+            </w:r>
+          </w:p>
+        </w:tc>
+        <w:tc>
+          <w:tcPr>
+            <w:tcW w:w="1134" w:type="dxa"/>
+            <w:tcBorders>
+              <w:top w:val="single" w:sz="6" w:space="0" w:color="000000"/>
+              <w:left w:val="single" w:sz="6" w:space="0" w:color="000000"/>
+              <w:bottom w:val="single" w:sz="6" w:space="0" w:color="000000"/>
+              <w:right w:val="single" w:sz="6" w:space="0" w:color="000000"/>
+            </w:tcBorders>
+            <w:shd w:val="clear" w:color="auto" w:fill="FFFFFF"/>
+          </w:tcPr>
+          <w:p>
+            <w:pPr>
+              <w:tabs>
+                <w:tab w:val="left" w:pos="1068"/>
+              </w:tabs>
+              <w:rPr>
+                <w:b/>
+                <w:bCs/>
+              </w:rPr>
+            </w:pPr>
+            <w:r>
+              <w:rPr>
+                <w:b/>
+                <w:bCs/>
+              </w:rPr>
+              <w:t>Medium</w:t>
+            </w:r>
+          </w:p>
+        </w:tc>
+        <w:tc>
+          <w:tcPr>
+            <w:tcW w:w="851" w:type="dxa"/>
+            <w:tcBorders>
+              <w:top w:val="single" w:sz="6" w:space="0" w:color="000000"/>
+              <w:left w:val="single" w:sz="6" w:space="0" w:color="000000"/>
+              <w:bottom w:val="single" w:sz="6" w:space="0" w:color="000000"/>
+              <w:right w:val="single" w:sz="6" w:space="0" w:color="000000"/>
+            </w:tcBorders>
+            <w:shd w:val="clear" w:color="auto" w:fill="FFFFFF"/>
+          </w:tcPr>
+          <w:p>
+            <w:pPr>
+              <w:rPr>
+                <w:b/>
+                <w:bCs/>
+              </w:rPr>
+            </w:pPr>
+            <w:r>
+              <w:rPr>
+                <w:b/>
+                <w:bCs/>
+              </w:rPr>
+              <w:t>High</w:t>
+            </w:r>
+          </w:p>
+        </w:tc>
+        <w:tc>
+          <w:tcPr>
+            <w:tcW w:w="850" w:type="dxa"/>
+            <w:tcBorders>
+              <w:top w:val="single" w:sz="6" w:space="0" w:color="000000"/>
+              <w:left w:val="single" w:sz="6" w:space="0" w:color="000000"/>
+              <w:bottom w:val="single" w:sz="6" w:space="0" w:color="000000"/>
+              <w:right w:val="single" w:sz="6" w:space="0" w:color="000000"/>
+            </w:tcBorders>
+            <w:shd w:val="clear" w:color="auto" w:fill="FFFFFF"/>
+          </w:tcPr>
+          <w:p>
+            <w:pPr>
+              <w:rPr>
+                <w:b/>
+                <w:bCs/>
+              </w:rPr>
+            </w:pPr>
+            <w:r>
+              <w:rPr>
+                <w:b/>
+                <w:bCs/>
+              </w:rPr>
+              <w:t>High</w:t>
+            </w:r>
+          </w:p>
+        </w:tc>
+        <w:tc>
+          <w:tcPr>
+            <w:tcW w:w="1559" w:type="dxa"/>
+            <w:tcBorders>
+              <w:top w:val="single" w:sz="6" w:space="0" w:color="000000"/>
+              <w:left w:val="single" w:sz="6" w:space="0" w:color="000000"/>
+              <w:bottom w:val="single" w:sz="6" w:space="0" w:color="000000"/>
+              <w:right w:val="single" w:sz="6" w:space="0" w:color="000000"/>
+            </w:tcBorders>
+            <w:shd w:val="clear" w:color="auto" w:fill="FFFFFF"/>
+          </w:tcPr>
+          <w:p>
+            <w:pPr>
+              <w:rPr>
+                <w:b/>
+                <w:bCs/>
+              </w:rPr>
+            </w:pPr>
+            <w:r>
+              <w:rPr>
+                <w:b/>
+                <w:bCs/>
+              </w:rPr>
+              <w:t>Test login, role access, routing and important user flows in the deployed environment before production promotion.</w:t>
+            </w:r>
+          </w:p>
+        </w:tc>
+        <w:tc>
+          <w:tcPr>
+            <w:tcW w:w="1843" w:type="dxa"/>
+            <w:tcBorders>
+              <w:top w:val="single" w:sz="6" w:space="0" w:color="000000"/>
+              <w:left w:val="single" w:sz="6" w:space="0" w:color="000000"/>
+              <w:bottom w:val="single" w:sz="6" w:space="0" w:color="000000"/>
+              <w:right w:val="single" w:sz="6" w:space="0" w:color="000000"/>
+            </w:tcBorders>
+            <w:shd w:val="clear" w:color="auto" w:fill="FFFFFF"/>
+          </w:tcPr>
+          <w:p>
+            <w:pPr>
+              <w:rPr>
+                <w:b/>
+                <w:bCs/>
+              </w:rPr>
+            </w:pPr>
+            <w:r>
+              <w:rPr>
+                <w:b/>
+                <w:bCs/>
+              </w:rPr>
+              <w:t>Roll back the affected deployment and correct the configuration or application issue before redeploying.</w:t>
+            </w:r>
+          </w:p>
+        </w:tc>
+        <w:tc>
+          <w:tcPr>
+            <w:tcW w:w="1559" w:type="dxa"/>
+            <w:tcBorders>
+              <w:top w:val="single" w:sz="6" w:space="0" w:color="000000"/>
+              <w:left w:val="single" w:sz="6" w:space="0" w:color="000000"/>
+              <w:bottom w:val="single" w:sz="6" w:space="0" w:color="000000"/>
+              <w:right w:val="single" w:sz="6" w:space="0" w:color="000000"/>
+            </w:tcBorders>
+            <w:shd w:val="clear" w:color="auto" w:fill="FFFFFF"/>
+          </w:tcPr>
+          <w:p>
+            <w:pPr>
+              <w:rPr>
+                <w:b/>
+                <w:bCs/>
+              </w:rPr>
+            </w:pPr>
+            <w:r>
+              <w:rPr>
+                <w:b/>
+                <w:bCs/>
+              </w:rPr>
+              <w:t>Project Team</w:t>
+            </w:r>
+          </w:p>
+        </w:tc>
+        <w:tc>
+          <w:tcPr>
+            <w:tcW w:w="851" w:type="dxa"/>
+            <w:tcBorders>
+              <w:top w:val="single" w:sz="6" w:space="0" w:color="000000"/>
+              <w:left w:val="single" w:sz="6" w:space="0" w:color="000000"/>
+              <w:bottom w:val="single" w:sz="6" w:space="0" w:color="000000"/>
+              <w:right w:val="single" w:sz="6" w:space="0" w:color="000000"/>
+            </w:tcBorders>
+            <w:shd w:val="clear" w:color="auto" w:fill="FFFFFF"/>
+          </w:tcPr>
+          <w:p>
+            <w:pPr>
+              <w:rPr>
+                <w:b/>
+                <w:bCs/>
+              </w:rPr>
+            </w:pPr>
+            <w:r>
+              <w:rPr>
+                <w:b/>
+                <w:bCs/>
+              </w:rPr>
+              <w:t>Open</w:t>
+            </w:r>
+          </w:p>
+        </w:tc>
+      </w:tr>
+      <w:tr>
+        <w:trPr>
+          <w:trHeight w:val="300"/>
+        </w:trPr>
+        <w:tc>
+          <w:tcPr>
+            <w:tcW w:w="812" w:type="dxa"/>
+            <w:tcBorders>
+              <w:top w:val="single" w:sz="6" w:space="0" w:color="000000"/>
+              <w:left w:val="single" w:sz="6" w:space="0" w:color="000000"/>
+              <w:bottom w:val="single" w:sz="6" w:space="0" w:color="000000"/>
+              <w:right w:val="single" w:sz="6" w:space="0" w:color="000000"/>
+            </w:tcBorders>
+            <w:shd w:val="clear" w:color="auto" w:fill="FFFFFF"/>
+          </w:tcPr>
+          <w:p>
+            <w:pPr>
+              <w:rPr>
+                <w:b/>
+                <w:bCs/>
+              </w:rPr>
+            </w:pPr>
+          </w:p>
+        </w:tc>
+        <w:tc>
+          <w:tcPr>
+            <w:tcW w:w="2299" w:type="dxa"/>
+            <w:tcBorders>
+              <w:top w:val="single" w:sz="6" w:space="0" w:color="000000"/>
+              <w:left w:val="single" w:sz="6" w:space="0" w:color="000000"/>
+              <w:bottom w:val="single" w:sz="6" w:space="0" w:color="000000"/>
+              <w:right w:val="single" w:sz="6" w:space="0" w:color="000000"/>
+            </w:tcBorders>
+            <w:shd w:val="clear" w:color="auto" w:fill="FFFFFF"/>
+          </w:tcPr>
+          <w:p>
+            <w:pPr>
+              <w:rPr>
+                <w:b/>
+                <w:bCs/>
+              </w:rPr>
+            </w:pPr>
+          </w:p>
+        </w:tc>
+        <w:tc>
+          <w:tcPr>
+            <w:tcW w:w="2126" w:type="dxa"/>
+            <w:tcBorders>
+              <w:top w:val="single" w:sz="6" w:space="0" w:color="000000"/>
+              <w:left w:val="single" w:sz="6" w:space="0" w:color="000000"/>
+              <w:bottom w:val="single" w:sz="6" w:space="0" w:color="000000"/>
+              <w:right w:val="single" w:sz="6" w:space="0" w:color="000000"/>
+            </w:tcBorders>
+            <w:shd w:val="clear" w:color="auto" w:fill="FFFFFF"/>
+          </w:tcPr>
+          <w:p>
+            <w:pPr>
+              <w:rPr>
+                <w:b/>
+                <w:bCs/>
+              </w:rPr>
+            </w:pPr>
+          </w:p>
+        </w:tc>
+        <w:tc>
+          <w:tcPr>
+            <w:tcW w:w="1134" w:type="dxa"/>
+            <w:tcBorders>
+              <w:top w:val="single" w:sz="6" w:space="0" w:color="000000"/>
+              <w:left w:val="single" w:sz="6" w:space="0" w:color="000000"/>
+              <w:bottom w:val="single" w:sz="6" w:space="0" w:color="000000"/>
+              <w:right w:val="single" w:sz="6" w:space="0" w:color="000000"/>
+            </w:tcBorders>
+            <w:shd w:val="clear" w:color="auto" w:fill="FFFFFF"/>
+          </w:tcPr>
+          <w:p>
+            <w:pPr>
+              <w:tabs>
+                <w:tab w:val="left" w:pos="1068"/>
+              </w:tabs>
+              <w:rPr>
+                <w:b/>
+                <w:bCs/>
+              </w:rPr>
+            </w:pPr>
+          </w:p>
+        </w:tc>
+        <w:tc>
+          <w:tcPr>
+            <w:tcW w:w="851" w:type="dxa"/>
+            <w:tcBorders>
+              <w:top w:val="single" w:sz="6" w:space="0" w:color="000000"/>
+              <w:left w:val="single" w:sz="6" w:space="0" w:color="000000"/>
+              <w:bottom w:val="single" w:sz="6" w:space="0" w:color="000000"/>
+              <w:right w:val="single" w:sz="6" w:space="0" w:color="000000"/>
+            </w:tcBorders>
+            <w:shd w:val="clear" w:color="auto" w:fill="FFFFFF"/>
+          </w:tcPr>
+          <w:p>
+            <w:pPr>
+              <w:rPr>
+                <w:b/>
+                <w:bCs/>
+              </w:rPr>
+            </w:pPr>
+          </w:p>
+        </w:tc>
+        <w:tc>
+          <w:tcPr>
+            <w:tcW w:w="850" w:type="dxa"/>
+            <w:tcBorders>
+              <w:top w:val="single" w:sz="6" w:space="0" w:color="000000"/>
+              <w:left w:val="single" w:sz="6" w:space="0" w:color="000000"/>
+              <w:bottom w:val="single" w:sz="6" w:space="0" w:color="000000"/>
+              <w:right w:val="single" w:sz="6" w:space="0" w:color="000000"/>
+            </w:tcBorders>
+            <w:shd w:val="clear" w:color="auto" w:fill="FFFFFF"/>
+          </w:tcPr>
+          <w:p>
+            <w:pPr>
+              <w:rPr>
+                <w:b/>
+                <w:bCs/>
+              </w:rPr>
+            </w:pPr>
+          </w:p>
+        </w:tc>
+        <w:tc>
+          <w:tcPr>
+            <w:tcW w:w="1559" w:type="dxa"/>
+            <w:tcBorders>
+              <w:top w:val="single" w:sz="6" w:space="0" w:color="000000"/>
+              <w:left w:val="single" w:sz="6" w:space="0" w:color="000000"/>
+              <w:bottom w:val="single" w:sz="6" w:space="0" w:color="000000"/>
+              <w:right w:val="single" w:sz="6" w:space="0" w:color="000000"/>
+            </w:tcBorders>
+            <w:shd w:val="clear" w:color="auto" w:fill="FFFFFF"/>
+          </w:tcPr>
+          <w:p>
+            <w:pPr>
+              <w:rPr>
+                <w:b/>
+                <w:bCs/>
+              </w:rPr>
+            </w:pPr>
+          </w:p>
+        </w:tc>
+        <w:tc>
+          <w:tcPr>
+            <w:tcW w:w="1843" w:type="dxa"/>
+            <w:tcBorders>
+              <w:top w:val="single" w:sz="6" w:space="0" w:color="000000"/>
+              <w:left w:val="single" w:sz="6" w:space="0" w:color="000000"/>
+              <w:bottom w:val="single" w:sz="6" w:space="0" w:color="000000"/>
+              <w:right w:val="single" w:sz="6" w:space="0" w:color="000000"/>
+            </w:tcBorders>
+            <w:shd w:val="clear" w:color="auto" w:fill="FFFFFF"/>
+          </w:tcPr>
+          <w:p>
+            <w:pPr>
+              <w:rPr>
+                <w:b/>
+                <w:bCs/>
+              </w:rPr>
+            </w:pPr>
+          </w:p>
+        </w:tc>
+        <w:tc>
+          <w:tcPr>
+            <w:tcW w:w="1559" w:type="dxa"/>
+            <w:tcBorders>
+              <w:top w:val="single" w:sz="6" w:space="0" w:color="000000"/>
+              <w:left w:val="single" w:sz="6" w:space="0" w:color="000000"/>
+              <w:bottom w:val="single" w:sz="6" w:space="0" w:color="000000"/>
+              <w:right w:val="single" w:sz="6" w:space="0" w:color="000000"/>
+            </w:tcBorders>
+            <w:shd w:val="clear" w:color="auto" w:fill="FFFFFF"/>
+          </w:tcPr>
+          <w:p>
+            <w:pPr>
+              <w:rPr>
+                <w:b/>
+                <w:bCs/>
+              </w:rPr>
+            </w:pPr>
+          </w:p>
+        </w:tc>
+        <w:tc>
+          <w:tcPr>
+            <w:tcW w:w="851" w:type="dxa"/>
+            <w:tcBorders>
+              <w:top w:val="single" w:sz="6" w:space="0" w:color="000000"/>
+              <w:left w:val="single" w:sz="6" w:space="0" w:color="000000"/>
+              <w:bottom w:val="single" w:sz="6" w:space="0" w:color="000000"/>
+              <w:right w:val="single" w:sz="6" w:space="0" w:color="000000"/>
+            </w:tcBorders>
+            <w:shd w:val="clear" w:color="auto" w:fill="FFFFFF"/>
+          </w:tcPr>
+          <w:p>
+            <w:pPr>
+              <w:rPr>
+                <w:b/>
+                <w:bCs/>
+              </w:rPr>
+            </w:pPr>
           </w:p>
         </w:tc>
       </w:tr>
@@ -4179,6 +6259,56 @@
     </w:sectPr>
   </w:body>
 </w:document>
+</file>
+
+<file path=word/endnotes.xml><?xml version="1.0" encoding="utf-8"?>
+<w:endnotes xmlns:wpc="http://schemas.microsoft.com/office/word/2010/wordprocessingCanvas" xmlns:cx="http://schemas.microsoft.com/office/drawing/2014/chartex" xmlns:cx1="http://schemas.microsoft.com/office/drawing/2015/9/8/chartex" xmlns:cx2="http://schemas.microsoft.com/office/drawing/2015/10/21/chartex" xmlns:cx3="http://schemas.microsoft.com/office/drawing/2016/5/9/chartex" xmlns:cx4="http://schemas.microsoft.com/office/drawing/2016/5/10/chartex" xmlns:cx5="http://schemas.microsoft.com/office/drawing/2016/5/11/chartex" xmlns:cx6="http://schemas.microsoft.com/office/drawing/2016/5/12/chartex" xmlns:cx7="http://schemas.microsoft.com/office/drawing/2016/5/13/chartex" xmlns:cx8="http://schemas.microsoft.com/office/drawing/2016/5/14/chartex" xmlns:mc="http://schemas.openxmlformats.org/markup-compatibility/2006" xmlns:aink="http://schemas.microsoft.com/office/drawing/2016/ink" xmlns:am3d="http://schemas.microsoft.com/office/drawing/2017/model3d" xmlns:o="urn:schemas-microsoft-com:office:office" xmlns:oel="http://schemas.microsoft.com/office/2019/extlst" xmlns:r="http://schemas.openxmlformats.org/officeDocument/2006/relationships" xmlns:m="http://schemas.openxmlformats.org/officeDocument/2006/math" xmlns:v="urn:schemas-microsoft-com:vml" xmlns:wp14="http://schemas.microsoft.com/office/word/2010/wordprocessingDrawing" xmlns:wp="http://schemas.openxmlformats.org/drawingml/2006/wordprocessingDrawing" xmlns:w10="urn:schemas-microsoft-com:office:word" xmlns:w="http://schemas.openxmlformats.org/wordprocessingml/2006/main" xmlns:w14="http://schemas.microsoft.com/office/word/2010/wordml" xmlns:w15="http://schemas.microsoft.com/office/word/2012/wordml" xmlns:w16cex="http://schemas.microsoft.com/office/word/2018/wordml/cex" xmlns:w16cid="http://schemas.microsoft.com/office/word/2016/wordml/cid" xmlns:w16="http://schemas.microsoft.com/office/word/2018/wordml" xmlns:w16du="http://schemas.microsoft.com/office/word/2023/wordml/word16du" xmlns:w16sdtdh="http://schemas.microsoft.com/office/word/2020/wordml/sdtdatahash" xmlns:w16sdtfl="http://schemas.microsoft.com/office/word/2024/wordml/sdtformatlock" xmlns:w16se="http://schemas.microsoft.com/office/word/2015/wordml/symex" xmlns:wpg="http://schemas.microsoft.com/office/word/2010/wordprocessingGroup" xmlns:wpi="http://schemas.microsoft.com/office/word/2010/wordprocessingInk" xmlns:wne="http://schemas.microsoft.com/office/word/2006/wordml" xmlns:wps="http://schemas.microsoft.com/office/word/2010/wordprocessingShape" mc:Ignorable="w14 w15 w16se w16cid w16 w16cex w16sdtdh w16sdtfl w16du wp14">
+  <w:endnote w:type="separator" w:id="-1">
+    <w:p>
+      <w:pPr>
+        <w:spacing w:after="0" w:line="240" w:lineRule="auto"/>
+      </w:pPr>
+      <w:r>
+        <w:separator/>
+      </w:r>
+    </w:p>
+  </w:endnote>
+  <w:endnote w:type="continuationSeparator" w:id="0">
+    <w:p>
+      <w:pPr>
+        <w:spacing w:after="0" w:line="240" w:lineRule="auto"/>
+      </w:pPr>
+      <w:r>
+        <w:continuationSeparator/>
+      </w:r>
+    </w:p>
+  </w:endnote>
+</w:endnotes>
+</file>
+
+<file path=word/footnotes.xml><?xml version="1.0" encoding="utf-8"?>
+<w:footnotes xmlns:wpc="http://schemas.microsoft.com/office/word/2010/wordprocessingCanvas" xmlns:cx="http://schemas.microsoft.com/office/drawing/2014/chartex" xmlns:cx1="http://schemas.microsoft.com/office/drawing/2015/9/8/chartex" xmlns:cx2="http://schemas.microsoft.com/office/drawing/2015/10/21/chartex" xmlns:cx3="http://schemas.microsoft.com/office/drawing/2016/5/9/chartex" xmlns:cx4="http://schemas.microsoft.com/office/drawing/2016/5/10/chartex" xmlns:cx5="http://schemas.microsoft.com/office/drawing/2016/5/11/chartex" xmlns:cx6="http://schemas.microsoft.com/office/drawing/2016/5/12/chartex" xmlns:cx7="http://schemas.microsoft.com/office/drawing/2016/5/13/chartex" xmlns:cx8="http://schemas.microsoft.com/office/drawing/2016/5/14/chartex" xmlns:mc="http://schemas.openxmlformats.org/markup-compatibility/2006" xmlns:aink="http://schemas.microsoft.com/office/drawing/2016/ink" xmlns:am3d="http://schemas.microsoft.com/office/drawing/2017/model3d" xmlns:o="urn:schemas-microsoft-com:office:office" xmlns:oel="http://schemas.microsoft.com/office/2019/extlst" xmlns:r="http://schemas.openxmlformats.org/officeDocument/2006/relationships" xmlns:m="http://schemas.openxmlformats.org/officeDocument/2006/math" xmlns:v="urn:schemas-microsoft-com:vml" xmlns:wp14="http://schemas.microsoft.com/office/word/2010/wordprocessingDrawing" xmlns:wp="http://schemas.openxmlformats.org/drawingml/2006/wordprocessingDrawing" xmlns:w10="urn:schemas-microsoft-com:office:word" xmlns:w="http://schemas.openxmlformats.org/wordprocessingml/2006/main" xmlns:w14="http://schemas.microsoft.com/office/word/2010/wordml" xmlns:w15="http://schemas.microsoft.com/office/word/2012/wordml" xmlns:w16cex="http://schemas.microsoft.com/office/word/2018/wordml/cex" xmlns:w16cid="http://schemas.microsoft.com/office/word/2016/wordml/cid" xmlns:w16="http://schemas.microsoft.com/office/word/2018/wordml" xmlns:w16du="http://schemas.microsoft.com/office/word/2023/wordml/word16du" xmlns:w16sdtdh="http://schemas.microsoft.com/office/word/2020/wordml/sdtdatahash" xmlns:w16sdtfl="http://schemas.microsoft.com/office/word/2024/wordml/sdtformatlock" xmlns:w16se="http://schemas.microsoft.com/office/word/2015/wordml/symex" xmlns:wpg="http://schemas.microsoft.com/office/word/2010/wordprocessingGroup" xmlns:wpi="http://schemas.microsoft.com/office/word/2010/wordprocessingInk" xmlns:wne="http://schemas.microsoft.com/office/word/2006/wordml" xmlns:wps="http://schemas.microsoft.com/office/word/2010/wordprocessingShape" mc:Ignorable="w14 w15 w16se w16cid w16 w16cex w16sdtdh w16sdtfl w16du wp14">
+  <w:footnote w:type="separator" w:id="-1">
+    <w:p>
+      <w:pPr>
+        <w:spacing w:after="0" w:line="240" w:lineRule="auto"/>
+      </w:pPr>
+      <w:r>
+        <w:separator/>
+      </w:r>
+    </w:p>
+  </w:footnote>
+  <w:footnote w:type="continuationSeparator" w:id="0">
+    <w:p>
+      <w:pPr>
+        <w:spacing w:after="0" w:line="240" w:lineRule="auto"/>
+      </w:pPr>
+      <w:r>
+        <w:continuationSeparator/>
+      </w:r>
+    </w:p>
+  </w:footnote>
+</w:footnotes>
 </file>
 
 <file path=word/styles.xml><?xml version="1.0" encoding="utf-8"?>
@@ -4785,7 +6915,6 @@
   <w:style w:type="character" w:default="1" w:styleId="DefaultParagraphFont">
     <w:name w:val="Default Paragraph Font"/>
     <w:uiPriority w:val="1"/>
-    <w:semiHidden/>
     <w:unhideWhenUsed/>
   </w:style>
   <w:style w:type="table" w:default="1" w:styleId="TableNormal">
@@ -5118,6 +7247,50 @@
       </w:tblBorders>
     </w:tblPr>
   </w:style>
+  <w:style w:type="paragraph" w:styleId="Header">
+    <w:name w:val="header"/>
+    <w:basedOn w:val="Normal"/>
+    <w:link w:val="HeaderChar"/>
+    <w:uiPriority w:val="99"/>
+    <w:unhideWhenUsed/>
+    <w:rsid w:val="0069445A"/>
+    <w:pPr>
+      <w:tabs>
+        <w:tab w:val="center" w:pos="4513"/>
+        <w:tab w:val="right" w:pos="9026"/>
+      </w:tabs>
+      <w:spacing w:after="0" w:line="240" w:lineRule="auto"/>
+    </w:pPr>
+  </w:style>
+  <w:style w:type="character" w:customStyle="1" w:styleId="HeaderChar">
+    <w:name w:val="Header Char"/>
+    <w:basedOn w:val="DefaultParagraphFont"/>
+    <w:link w:val="Header"/>
+    <w:uiPriority w:val="99"/>
+    <w:rsid w:val="0069445A"/>
+  </w:style>
+  <w:style w:type="paragraph" w:styleId="Footer">
+    <w:name w:val="footer"/>
+    <w:basedOn w:val="Normal"/>
+    <w:link w:val="FooterChar"/>
+    <w:uiPriority w:val="99"/>
+    <w:unhideWhenUsed/>
+    <w:rsid w:val="0069445A"/>
+    <w:pPr>
+      <w:tabs>
+        <w:tab w:val="center" w:pos="4513"/>
+        <w:tab w:val="right" w:pos="9026"/>
+      </w:tabs>
+      <w:spacing w:after="0" w:line="240" w:lineRule="auto"/>
+    </w:pPr>
+  </w:style>
+  <w:style w:type="character" w:customStyle="1" w:styleId="FooterChar">
+    <w:name w:val="Footer Char"/>
+    <w:basedOn w:val="DefaultParagraphFont"/>
+    <w:link w:val="Footer"/>
+    <w:uiPriority w:val="99"/>
+    <w:rsid w:val="0069445A"/>
+  </w:style>
 </w:styles>
 </file>
 

</xml_diff>